<commit_message>
Update resume, senior software development engineer
</commit_message>
<xml_diff>
--- a/public/travis-hoki-resume.docx
+++ b/public/travis-hoki-resume.docx
@@ -4,9 +4,15 @@
   <w:body>
     <w:p>
       <w:pPr>
-        <w:pStyle w:val="Body"/>
+        <w:pStyle w:val="Body A"/>
         <w:spacing w:after="20" w:line="264" w:lineRule="auto"/>
         <w:jc w:val="center"/>
+        <w:rPr>
+          <w:b w:val="1"/>
+          <w:bCs w:val="1"/>
+          <w:sz w:val="22"/>
+          <w:szCs w:val="22"/>
+        </w:rPr>
       </w:pPr>
       <w:r>
         <w:rPr>
@@ -30,9 +36,12 @@
     </w:p>
     <w:p>
       <w:pPr>
-        <w:pStyle w:val="Body"/>
+        <w:pStyle w:val="Body A"/>
         <w:spacing w:after="60" w:line="264" w:lineRule="auto"/>
         <w:jc w:val="center"/>
+        <w:rPr>
+          <w:lang w:val="en-US"/>
+        </w:rPr>
       </w:pPr>
       <w:r>
         <w:rPr>
@@ -51,12 +60,88 @@
             </w14:solidFill>
           </w14:textFill>
         </w:rPr>
-        <w:t>Senior Frontend Engineer / Front-End Web Developer</w:t>
-      </w:r>
-    </w:p>
-    <w:p>
-      <w:pPr>
-        <w:pStyle w:val="Body"/>
+        <w:t xml:space="preserve">Senior </w:t>
+      </w:r>
+      <w:r>
+        <w:rPr>
+          <w:b w:val="1"/>
+          <w:bCs w:val="1"/>
+          <w:outline w:val="0"/>
+          <w:color w:val="666666"/>
+          <w:sz w:val="22"/>
+          <w:szCs w:val="22"/>
+          <w:u w:color="666666"/>
+          <w:rtl w:val="0"/>
+          <w:lang w:val="en-US"/>
+          <w14:textFill>
+            <w14:solidFill>
+              <w14:srgbClr w14:val="666666"/>
+            </w14:solidFill>
+          </w14:textFill>
+        </w:rPr>
+        <w:t>Software</w:t>
+      </w:r>
+      <w:r>
+        <w:rPr>
+          <w:b w:val="1"/>
+          <w:bCs w:val="1"/>
+          <w:outline w:val="0"/>
+          <w:color w:val="666666"/>
+          <w:sz w:val="22"/>
+          <w:szCs w:val="22"/>
+          <w:u w:color="666666"/>
+          <w:rtl w:val="0"/>
+          <w:lang w:val="en-US"/>
+          <w14:textFill>
+            <w14:solidFill>
+              <w14:srgbClr w14:val="666666"/>
+            </w14:solidFill>
+          </w14:textFill>
+        </w:rPr>
+        <w:t xml:space="preserve"> </w:t>
+      </w:r>
+      <w:r>
+        <w:rPr>
+          <w:b w:val="1"/>
+          <w:bCs w:val="1"/>
+          <w:outline w:val="0"/>
+          <w:color w:val="666666"/>
+          <w:sz w:val="22"/>
+          <w:szCs w:val="22"/>
+          <w:u w:color="666666"/>
+          <w:rtl w:val="0"/>
+          <w:lang w:val="en-US"/>
+          <w14:textFill>
+            <w14:solidFill>
+              <w14:srgbClr w14:val="666666"/>
+            </w14:solidFill>
+          </w14:textFill>
+        </w:rPr>
+        <w:t xml:space="preserve">Development </w:t>
+      </w:r>
+      <w:r>
+        <w:rPr>
+          <w:b w:val="1"/>
+          <w:bCs w:val="1"/>
+          <w:outline w:val="0"/>
+          <w:color w:val="666666"/>
+          <w:sz w:val="22"/>
+          <w:szCs w:val="22"/>
+          <w:u w:color="666666"/>
+          <w:rtl w:val="0"/>
+          <w:lang w:val="en-US"/>
+          <w14:textFill>
+            <w14:solidFill>
+              <w14:srgbClr w14:val="666666"/>
+            </w14:solidFill>
+          </w14:textFill>
+        </w:rPr>
+        <w:t>Engineer</w:t>
+      </w:r>
+    </w:p>
+    <w:p>
+      <w:pPr>
+        <w:pStyle w:val="Body A"/>
         <w:spacing w:after="160" w:line="264" w:lineRule="auto"/>
         <w:jc w:val="center"/>
       </w:pPr>
@@ -72,7 +157,7 @@
     </w:p>
     <w:p>
       <w:pPr>
-        <w:pStyle w:val="Body"/>
+        <w:pStyle w:val="Body A"/>
         <w:keepNext w:val="1"/>
         <w:pBdr>
           <w:top w:val="nil"/>
@@ -81,6 +166,9 @@
           <w:right w:val="nil"/>
         </w:pBdr>
         <w:spacing w:before="40" w:after="60" w:line="264" w:lineRule="auto"/>
+        <w:rPr>
+          <w:lang w:val="en-US"/>
+        </w:rPr>
       </w:pPr>
       <w:r>
         <w:rPr>
@@ -104,9 +192,12 @@
     </w:p>
     <w:p>
       <w:pPr>
-        <w:pStyle w:val="Body"/>
+        <w:pStyle w:val="Body A"/>
         <w:spacing w:before="40" w:after="120" w:line="264" w:lineRule="auto"/>
         <w:ind w:firstLine="216"/>
+        <w:rPr>
+          <w:lang w:val="en-US"/>
+        </w:rPr>
       </w:pPr>
       <w:r>
         <w:rPr>
@@ -118,7 +209,7 @@
     </w:p>
     <w:p>
       <w:pPr>
-        <w:pStyle w:val="Body"/>
+        <w:pStyle w:val="Body A"/>
         <w:keepNext w:val="1"/>
         <w:pBdr>
           <w:top w:val="nil"/>
@@ -127,6 +218,9 @@
           <w:right w:val="nil"/>
         </w:pBdr>
         <w:spacing w:before="160" w:after="60" w:line="264" w:lineRule="auto"/>
+        <w:rPr>
+          <w:lang w:val="da-DK"/>
+        </w:rPr>
       </w:pPr>
       <w:r>
         <w:rPr>
@@ -150,7 +244,7 @@
     </w:p>
     <w:p>
       <w:pPr>
-        <w:pStyle w:val="Body"/>
+        <w:pStyle w:val="Body A"/>
         <w:spacing w:before="20" w:after="40" w:line="264" w:lineRule="auto"/>
       </w:pPr>
       <w:r>
@@ -158,6 +252,7 @@
           <w:b w:val="1"/>
           <w:bCs w:val="1"/>
           <w:rtl w:val="0"/>
+          <w:lang w:val="de-DE"/>
         </w:rPr>
         <w:t xml:space="preserve">•  </w:t>
       </w:r>
@@ -180,7 +275,7 @@
     </w:p>
     <w:p>
       <w:pPr>
-        <w:pStyle w:val="Body"/>
+        <w:pStyle w:val="Body A"/>
         <w:spacing w:before="20" w:after="40" w:line="264" w:lineRule="auto"/>
       </w:pPr>
       <w:r>
@@ -188,6 +283,7 @@
           <w:b w:val="1"/>
           <w:bCs w:val="1"/>
           <w:rtl w:val="0"/>
+          <w:lang w:val="de-DE"/>
         </w:rPr>
         <w:t xml:space="preserve">•  </w:t>
       </w:r>
@@ -210,7 +306,7 @@
     </w:p>
     <w:p>
       <w:pPr>
-        <w:pStyle w:val="Body"/>
+        <w:pStyle w:val="Body A"/>
         <w:spacing w:before="20" w:after="40" w:line="264" w:lineRule="auto"/>
       </w:pPr>
       <w:r>
@@ -218,6 +314,7 @@
           <w:b w:val="1"/>
           <w:bCs w:val="1"/>
           <w:rtl w:val="0"/>
+          <w:lang w:val="de-DE"/>
         </w:rPr>
         <w:t xml:space="preserve">•  </w:t>
       </w:r>
@@ -240,7 +337,7 @@
     </w:p>
     <w:p>
       <w:pPr>
-        <w:pStyle w:val="Body"/>
+        <w:pStyle w:val="Body A"/>
         <w:spacing w:before="20" w:after="40" w:line="264" w:lineRule="auto"/>
       </w:pPr>
       <w:r>
@@ -248,6 +345,7 @@
           <w:b w:val="1"/>
           <w:bCs w:val="1"/>
           <w:rtl w:val="0"/>
+          <w:lang w:val="de-DE"/>
         </w:rPr>
         <w:t xml:space="preserve">•  </w:t>
       </w:r>
@@ -270,7 +368,7 @@
     </w:p>
     <w:p>
       <w:pPr>
-        <w:pStyle w:val="Body"/>
+        <w:pStyle w:val="Body A"/>
         <w:keepNext w:val="1"/>
         <w:pBdr>
           <w:top w:val="nil"/>
@@ -302,7 +400,7 @@
     </w:p>
     <w:p>
       <w:pPr>
-        <w:pStyle w:val="Body"/>
+        <w:pStyle w:val="Body A"/>
         <w:keepNext w:val="1"/>
         <w:spacing w:before="100" w:after="40" w:line="264" w:lineRule="auto"/>
       </w:pPr>
@@ -326,6 +424,7 @@
       <w:r>
         <w:rPr>
           <w:rtl w:val="0"/>
+          <w:lang w:val="de-DE"/>
         </w:rPr>
         <w:t xml:space="preserve">  –  </w:t>
       </w:r>
@@ -341,6 +440,7 @@
       <w:r>
         <w:rPr>
           <w:rtl w:val="0"/>
+          <w:lang w:val="de-DE"/>
         </w:rPr>
         <w:t xml:space="preserve">  </w:t>
       </w:r>
@@ -352,6 +452,7 @@
           <w:szCs w:val="19"/>
           <w:u w:color="666666"/>
           <w:rtl w:val="0"/>
+          <w:lang w:val="de-DE"/>
           <w14:textFill>
             <w14:solidFill>
               <w14:srgbClr w14:val="666666"/>
@@ -368,6 +469,7 @@
           <w:szCs w:val="19"/>
           <w:u w:color="666666"/>
           <w:rtl w:val="0"/>
+          <w:lang w:val="de-DE"/>
           <w14:textFill>
             <w14:solidFill>
               <w14:srgbClr w14:val="666666"/>
@@ -401,10 +503,14 @@
           <w:ilvl w:val="0"/>
           <w:numId w:val="2"/>
         </w:numPr>
+        <w:bidi w:val="0"/>
         <w:spacing w:after="40" w:line="264" w:lineRule="auto"/>
-        <w:rPr>
-          <w:sz w:val="19"/>
-          <w:szCs w:val="19"/>
+        <w:ind w:right="0"/>
+        <w:jc w:val="left"/>
+        <w:rPr>
+          <w:sz w:val="19"/>
+          <w:szCs w:val="19"/>
+          <w:rtl w:val="0"/>
           <w:lang w:val="en-US"/>
         </w:rPr>
       </w:pPr>
@@ -425,10 +531,14 @@
           <w:ilvl w:val="0"/>
           <w:numId w:val="2"/>
         </w:numPr>
+        <w:bidi w:val="0"/>
         <w:spacing w:after="40" w:line="264" w:lineRule="auto"/>
-        <w:rPr>
-          <w:sz w:val="19"/>
-          <w:szCs w:val="19"/>
+        <w:ind w:right="0"/>
+        <w:jc w:val="left"/>
+        <w:rPr>
+          <w:sz w:val="19"/>
+          <w:szCs w:val="19"/>
+          <w:rtl w:val="0"/>
           <w:lang w:val="en-US"/>
         </w:rPr>
       </w:pPr>
@@ -449,10 +559,14 @@
           <w:ilvl w:val="0"/>
           <w:numId w:val="2"/>
         </w:numPr>
+        <w:bidi w:val="0"/>
         <w:spacing w:after="40" w:line="264" w:lineRule="auto"/>
-        <w:rPr>
-          <w:sz w:val="19"/>
-          <w:szCs w:val="19"/>
+        <w:ind w:right="0"/>
+        <w:jc w:val="left"/>
+        <w:rPr>
+          <w:sz w:val="19"/>
+          <w:szCs w:val="19"/>
+          <w:rtl w:val="0"/>
           <w:lang w:val="en-US"/>
         </w:rPr>
       </w:pPr>
@@ -468,7 +582,7 @@
     </w:p>
     <w:p>
       <w:pPr>
-        <w:pStyle w:val="Body"/>
+        <w:pStyle w:val="Body A"/>
         <w:keepNext w:val="1"/>
         <w:spacing w:before="100" w:after="40" w:line="264" w:lineRule="auto"/>
       </w:pPr>
@@ -492,6 +606,7 @@
       <w:r>
         <w:rPr>
           <w:rtl w:val="0"/>
+          <w:lang w:val="de-DE"/>
         </w:rPr>
         <w:t xml:space="preserve">  –  </w:t>
       </w:r>
@@ -507,6 +622,7 @@
       <w:r>
         <w:rPr>
           <w:rtl w:val="0"/>
+          <w:lang w:val="de-DE"/>
         </w:rPr>
         <w:t xml:space="preserve">  </w:t>
       </w:r>
@@ -518,6 +634,7 @@
           <w:szCs w:val="19"/>
           <w:u w:color="666666"/>
           <w:rtl w:val="0"/>
+          <w:lang w:val="de-DE"/>
           <w14:textFill>
             <w14:solidFill>
               <w14:srgbClr w14:val="666666"/>
@@ -534,6 +651,7 @@
           <w:szCs w:val="19"/>
           <w:u w:color="666666"/>
           <w:rtl w:val="0"/>
+          <w:lang w:val="de-DE"/>
           <w14:textFill>
             <w14:solidFill>
               <w14:srgbClr w14:val="666666"/>
@@ -550,6 +668,7 @@
           <w:szCs w:val="19"/>
           <w:u w:color="666666"/>
           <w:rtl w:val="0"/>
+          <w:lang w:val="de-DE"/>
           <w14:textFill>
             <w14:solidFill>
               <w14:srgbClr w14:val="666666"/>
@@ -566,10 +685,14 @@
           <w:ilvl w:val="0"/>
           <w:numId w:val="2"/>
         </w:numPr>
+        <w:bidi w:val="0"/>
         <w:spacing w:after="40" w:line="264" w:lineRule="auto"/>
-        <w:rPr>
-          <w:sz w:val="19"/>
-          <w:szCs w:val="19"/>
+        <w:ind w:right="0"/>
+        <w:jc w:val="left"/>
+        <w:rPr>
+          <w:sz w:val="19"/>
+          <w:szCs w:val="19"/>
+          <w:rtl w:val="0"/>
           <w:lang w:val="en-US"/>
         </w:rPr>
       </w:pPr>
@@ -590,10 +713,14 @@
           <w:ilvl w:val="0"/>
           <w:numId w:val="2"/>
         </w:numPr>
+        <w:bidi w:val="0"/>
         <w:spacing w:after="40" w:line="264" w:lineRule="auto"/>
-        <w:rPr>
-          <w:sz w:val="19"/>
-          <w:szCs w:val="19"/>
+        <w:ind w:right="0"/>
+        <w:jc w:val="left"/>
+        <w:rPr>
+          <w:sz w:val="19"/>
+          <w:szCs w:val="19"/>
+          <w:rtl w:val="0"/>
           <w:lang w:val="en-US"/>
         </w:rPr>
       </w:pPr>
@@ -614,10 +741,14 @@
           <w:ilvl w:val="0"/>
           <w:numId w:val="2"/>
         </w:numPr>
+        <w:bidi w:val="0"/>
         <w:spacing w:after="40" w:line="264" w:lineRule="auto"/>
-        <w:rPr>
-          <w:sz w:val="19"/>
-          <w:szCs w:val="19"/>
+        <w:ind w:right="0"/>
+        <w:jc w:val="left"/>
+        <w:rPr>
+          <w:sz w:val="19"/>
+          <w:szCs w:val="19"/>
+          <w:rtl w:val="0"/>
           <w:lang w:val="en-US"/>
         </w:rPr>
       </w:pPr>
@@ -633,7 +764,7 @@
     </w:p>
     <w:p>
       <w:pPr>
-        <w:pStyle w:val="Body"/>
+        <w:pStyle w:val="Body A"/>
         <w:keepNext w:val="1"/>
         <w:spacing w:before="100" w:after="40" w:line="264" w:lineRule="auto"/>
       </w:pPr>
@@ -657,6 +788,7 @@
       <w:r>
         <w:rPr>
           <w:rtl w:val="0"/>
+          <w:lang w:val="de-DE"/>
         </w:rPr>
         <w:t xml:space="preserve">  –  </w:t>
       </w:r>
@@ -672,6 +804,7 @@
       <w:r>
         <w:rPr>
           <w:rtl w:val="0"/>
+          <w:lang w:val="de-DE"/>
         </w:rPr>
         <w:t xml:space="preserve">  </w:t>
       </w:r>
@@ -683,6 +816,7 @@
           <w:szCs w:val="19"/>
           <w:u w:color="666666"/>
           <w:rtl w:val="0"/>
+          <w:lang w:val="de-DE"/>
           <w14:textFill>
             <w14:solidFill>
               <w14:srgbClr w14:val="666666"/>
@@ -699,6 +833,7 @@
           <w:szCs w:val="19"/>
           <w:u w:color="666666"/>
           <w:rtl w:val="0"/>
+          <w:lang w:val="de-DE"/>
           <w14:textFill>
             <w14:solidFill>
               <w14:srgbClr w14:val="666666"/>
@@ -715,6 +850,7 @@
           <w:szCs w:val="19"/>
           <w:u w:color="666666"/>
           <w:rtl w:val="0"/>
+          <w:lang w:val="de-DE"/>
           <w14:textFill>
             <w14:solidFill>
               <w14:srgbClr w14:val="666666"/>
@@ -731,10 +867,14 @@
           <w:ilvl w:val="0"/>
           <w:numId w:val="2"/>
         </w:numPr>
+        <w:bidi w:val="0"/>
         <w:spacing w:after="40" w:line="264" w:lineRule="auto"/>
-        <w:rPr>
-          <w:sz w:val="19"/>
-          <w:szCs w:val="19"/>
+        <w:ind w:right="0"/>
+        <w:jc w:val="left"/>
+        <w:rPr>
+          <w:sz w:val="19"/>
+          <w:szCs w:val="19"/>
+          <w:rtl w:val="0"/>
           <w:lang w:val="en-US"/>
         </w:rPr>
       </w:pPr>
@@ -755,10 +895,14 @@
           <w:ilvl w:val="0"/>
           <w:numId w:val="2"/>
         </w:numPr>
+        <w:bidi w:val="0"/>
         <w:spacing w:after="40" w:line="264" w:lineRule="auto"/>
-        <w:rPr>
-          <w:sz w:val="19"/>
-          <w:szCs w:val="19"/>
+        <w:ind w:right="0"/>
+        <w:jc w:val="left"/>
+        <w:rPr>
+          <w:sz w:val="19"/>
+          <w:szCs w:val="19"/>
+          <w:rtl w:val="0"/>
           <w:lang w:val="en-US"/>
         </w:rPr>
       </w:pPr>
@@ -779,10 +923,14 @@
           <w:ilvl w:val="0"/>
           <w:numId w:val="2"/>
         </w:numPr>
+        <w:bidi w:val="0"/>
         <w:spacing w:after="40" w:line="264" w:lineRule="auto"/>
-        <w:rPr>
-          <w:sz w:val="19"/>
-          <w:szCs w:val="19"/>
+        <w:ind w:right="0"/>
+        <w:jc w:val="left"/>
+        <w:rPr>
+          <w:sz w:val="19"/>
+          <w:szCs w:val="19"/>
+          <w:rtl w:val="0"/>
           <w:lang w:val="en-US"/>
         </w:rPr>
       </w:pPr>
@@ -798,7 +946,7 @@
     </w:p>
     <w:p>
       <w:pPr>
-        <w:pStyle w:val="Body"/>
+        <w:pStyle w:val="Body A"/>
         <w:keepNext w:val="1"/>
         <w:spacing w:before="100" w:after="40" w:line="264" w:lineRule="auto"/>
       </w:pPr>
@@ -822,6 +970,7 @@
       <w:r>
         <w:rPr>
           <w:rtl w:val="0"/>
+          <w:lang w:val="de-DE"/>
         </w:rPr>
         <w:t xml:space="preserve">  –  </w:t>
       </w:r>
@@ -837,6 +986,7 @@
       <w:r>
         <w:rPr>
           <w:rtl w:val="0"/>
+          <w:lang w:val="de-DE"/>
         </w:rPr>
         <w:t xml:space="preserve">  </w:t>
       </w:r>
@@ -848,6 +998,7 @@
           <w:szCs w:val="19"/>
           <w:u w:color="666666"/>
           <w:rtl w:val="0"/>
+          <w:lang w:val="de-DE"/>
           <w14:textFill>
             <w14:solidFill>
               <w14:srgbClr w14:val="666666"/>
@@ -864,6 +1015,7 @@
           <w:szCs w:val="19"/>
           <w:u w:color="666666"/>
           <w:rtl w:val="0"/>
+          <w:lang w:val="de-DE"/>
           <w14:textFill>
             <w14:solidFill>
               <w14:srgbClr w14:val="666666"/>
@@ -880,6 +1032,7 @@
           <w:szCs w:val="19"/>
           <w:u w:color="666666"/>
           <w:rtl w:val="0"/>
+          <w:lang w:val="de-DE"/>
           <w14:textFill>
             <w14:solidFill>
               <w14:srgbClr w14:val="666666"/>
@@ -896,10 +1049,14 @@
           <w:ilvl w:val="0"/>
           <w:numId w:val="2"/>
         </w:numPr>
+        <w:bidi w:val="0"/>
         <w:spacing w:after="40" w:line="264" w:lineRule="auto"/>
-        <w:rPr>
-          <w:sz w:val="19"/>
-          <w:szCs w:val="19"/>
+        <w:ind w:right="0"/>
+        <w:jc w:val="left"/>
+        <w:rPr>
+          <w:sz w:val="19"/>
+          <w:szCs w:val="19"/>
+          <w:rtl w:val="0"/>
           <w:lang w:val="en-US"/>
         </w:rPr>
       </w:pPr>
@@ -920,10 +1077,14 @@
           <w:ilvl w:val="0"/>
           <w:numId w:val="2"/>
         </w:numPr>
+        <w:bidi w:val="0"/>
         <w:spacing w:after="40" w:line="264" w:lineRule="auto"/>
-        <w:rPr>
-          <w:sz w:val="19"/>
-          <w:szCs w:val="19"/>
+        <w:ind w:right="0"/>
+        <w:jc w:val="left"/>
+        <w:rPr>
+          <w:sz w:val="19"/>
+          <w:szCs w:val="19"/>
+          <w:rtl w:val="0"/>
           <w:lang w:val="en-US"/>
         </w:rPr>
       </w:pPr>
@@ -939,7 +1100,7 @@
     </w:p>
     <w:p>
       <w:pPr>
-        <w:pStyle w:val="Body"/>
+        <w:pStyle w:val="Body A"/>
         <w:keepNext w:val="1"/>
         <w:spacing w:before="100" w:after="40" w:line="264" w:lineRule="auto"/>
       </w:pPr>
@@ -963,6 +1124,7 @@
       <w:r>
         <w:rPr>
           <w:rtl w:val="0"/>
+          <w:lang w:val="de-DE"/>
         </w:rPr>
         <w:t xml:space="preserve">  –  </w:t>
       </w:r>
@@ -978,6 +1140,7 @@
       <w:r>
         <w:rPr>
           <w:rtl w:val="0"/>
+          <w:lang w:val="de-DE"/>
         </w:rPr>
         <w:t xml:space="preserve">  </w:t>
       </w:r>
@@ -989,6 +1152,7 @@
           <w:szCs w:val="19"/>
           <w:u w:color="666666"/>
           <w:rtl w:val="0"/>
+          <w:lang w:val="de-DE"/>
           <w14:textFill>
             <w14:solidFill>
               <w14:srgbClr w14:val="666666"/>
@@ -1005,6 +1169,7 @@
           <w:szCs w:val="19"/>
           <w:u w:color="666666"/>
           <w:rtl w:val="0"/>
+          <w:lang w:val="de-DE"/>
           <w14:textFill>
             <w14:solidFill>
               <w14:srgbClr w14:val="666666"/>
@@ -1021,6 +1186,7 @@
           <w:szCs w:val="19"/>
           <w:u w:color="666666"/>
           <w:rtl w:val="0"/>
+          <w:lang w:val="de-DE"/>
           <w14:textFill>
             <w14:solidFill>
               <w14:srgbClr w14:val="666666"/>
@@ -1037,10 +1203,14 @@
           <w:ilvl w:val="0"/>
           <w:numId w:val="2"/>
         </w:numPr>
+        <w:bidi w:val="0"/>
         <w:spacing w:after="40" w:line="264" w:lineRule="auto"/>
-        <w:rPr>
-          <w:sz w:val="19"/>
-          <w:szCs w:val="19"/>
+        <w:ind w:right="0"/>
+        <w:jc w:val="left"/>
+        <w:rPr>
+          <w:sz w:val="19"/>
+          <w:szCs w:val="19"/>
+          <w:rtl w:val="0"/>
           <w:lang w:val="en-US"/>
         </w:rPr>
       </w:pPr>
@@ -1056,7 +1226,7 @@
     </w:p>
     <w:p>
       <w:pPr>
-        <w:pStyle w:val="Body"/>
+        <w:pStyle w:val="Body A"/>
         <w:keepNext w:val="1"/>
         <w:spacing w:before="100" w:after="40" w:line="264" w:lineRule="auto"/>
       </w:pPr>
@@ -1080,6 +1250,7 @@
       <w:r>
         <w:rPr>
           <w:rtl w:val="0"/>
+          <w:lang w:val="de-DE"/>
         </w:rPr>
         <w:t xml:space="preserve">  –  </w:t>
       </w:r>
@@ -1095,6 +1266,7 @@
       <w:r>
         <w:rPr>
           <w:rtl w:val="0"/>
+          <w:lang w:val="de-DE"/>
         </w:rPr>
         <w:t xml:space="preserve">  </w:t>
       </w:r>
@@ -1106,6 +1278,7 @@
           <w:szCs w:val="19"/>
           <w:u w:color="666666"/>
           <w:rtl w:val="0"/>
+          <w:lang w:val="de-DE"/>
           <w14:textFill>
             <w14:solidFill>
               <w14:srgbClr w14:val="666666"/>
@@ -1122,6 +1295,7 @@
           <w:szCs w:val="19"/>
           <w:u w:color="666666"/>
           <w:rtl w:val="0"/>
+          <w:lang w:val="de-DE"/>
           <w14:textFill>
             <w14:solidFill>
               <w14:srgbClr w14:val="666666"/>
@@ -1138,6 +1312,7 @@
           <w:szCs w:val="19"/>
           <w:u w:color="666666"/>
           <w:rtl w:val="0"/>
+          <w:lang w:val="de-DE"/>
           <w14:textFill>
             <w14:solidFill>
               <w14:srgbClr w14:val="666666"/>
@@ -1154,10 +1329,14 @@
           <w:ilvl w:val="0"/>
           <w:numId w:val="2"/>
         </w:numPr>
+        <w:bidi w:val="0"/>
         <w:spacing w:after="40" w:line="264" w:lineRule="auto"/>
-        <w:rPr>
-          <w:sz w:val="19"/>
-          <w:szCs w:val="19"/>
+        <w:ind w:right="0"/>
+        <w:jc w:val="left"/>
+        <w:rPr>
+          <w:sz w:val="19"/>
+          <w:szCs w:val="19"/>
+          <w:rtl w:val="0"/>
           <w:lang w:val="en-US"/>
         </w:rPr>
       </w:pPr>
@@ -1173,7 +1352,7 @@
     </w:p>
     <w:p>
       <w:pPr>
-        <w:pStyle w:val="Body"/>
+        <w:pStyle w:val="Body A"/>
         <w:keepNext w:val="1"/>
         <w:pBdr>
           <w:top w:val="nil"/>
@@ -1182,6 +1361,9 @@
           <w:right w:val="nil"/>
         </w:pBdr>
         <w:spacing w:before="160" w:after="60" w:line="264" w:lineRule="auto"/>
+        <w:rPr>
+          <w:lang w:val="en-US"/>
+        </w:rPr>
       </w:pPr>
       <w:r>
         <w:rPr>
@@ -1205,7 +1387,7 @@
     </w:p>
     <w:p>
       <w:pPr>
-        <w:pStyle w:val="Body"/>
+        <w:pStyle w:val="Body A"/>
         <w:spacing w:before="40" w:after="40" w:line="264" w:lineRule="auto"/>
       </w:pPr>
       <w:r>
@@ -1220,6 +1402,7 @@
       <w:r>
         <w:rPr>
           <w:rtl w:val="0"/>
+          <w:lang w:val="de-DE"/>
         </w:rPr>
         <w:t xml:space="preserve">  –  </w:t>
       </w:r>
@@ -1243,7 +1426,7 @@
     </w:p>
     <w:p>
       <w:pPr>
-        <w:pStyle w:val="Body"/>
+        <w:pStyle w:val="Body A"/>
         <w:spacing w:before="40" w:after="40" w:line="264" w:lineRule="auto"/>
       </w:pPr>
       <w:r>
@@ -1258,6 +1441,7 @@
       <w:r>
         <w:rPr>
           <w:rtl w:val="0"/>
+          <w:lang w:val="de-DE"/>
         </w:rPr>
         <w:t xml:space="preserve">  –  </w:t>
       </w:r>
@@ -1801,9 +1985,9 @@
       </w14:textFill>
     </w:rPr>
   </w:style>
-  <w:style w:type="paragraph" w:styleId="Body">
-    <w:name w:val="Body"/>
-    <w:next w:val="Body"/>
+  <w:style w:type="paragraph" w:styleId="Body A">
+    <w:name w:val="Body A"/>
+    <w:next w:val="Body A"/>
     <w:pPr>
       <w:keepNext w:val="0"/>
       <w:keepLines w:val="0"/>
@@ -1838,8 +2022,9 @@
       <w:shd w:val="nil" w:color="auto" w:fill="auto"/>
       <w:vertAlign w:val="baseline"/>
       <w:lang w:val="de-DE"/>
-      <w14:textOutline>
+      <w14:textOutline w14:w="12700" w14:cap="flat">
         <w14:noFill/>
+        <w14:miter w14:lim="400000"/>
       </w14:textOutline>
       <w14:textFill>
         <w14:solidFill>
@@ -2051,9 +2236,9 @@
         </a:effectStyle>
         <a:effectStyle>
           <a:effectLst>
-            <a:outerShdw sx="100000" sy="100000" kx="0" ky="0" algn="b" rotWithShape="0" blurRad="38100" dist="20000" dir="5400000">
+            <a:outerShdw sx="100000" sy="100000" kx="0" ky="0" algn="b" rotWithShape="0" blurRad="38100" dist="23000" dir="5400000">
               <a:srgbClr val="000000">
-                <a:alpha val="38000"/>
+                <a:alpha val="35000"/>
               </a:srgbClr>
             </a:outerShdw>
           </a:effectLst>
@@ -2133,7 +2318,7 @@
         </a:effectLst>
         <a:sp3d/>
       </a:spPr>
-      <a:bodyPr rot="0" spcFirstLastPara="1" vertOverflow="overflow" horzOverflow="overflow" vert="horz" wrap="square" lIns="45719" tIns="45719" rIns="45719" bIns="45719" numCol="1" spcCol="38100" rtlCol="0" anchor="ctr" upright="0">
+      <a:bodyPr rot="0" spcFirstLastPara="1" vertOverflow="overflow" horzOverflow="overflow" vert="horz" wrap="square" lIns="45718" tIns="45718" rIns="45718" bIns="45718" numCol="1" spcCol="38100" rtlCol="0" anchor="ctr" upright="0">
         <a:spAutoFit/>
       </a:bodyPr>
       <a:lstStyle>
@@ -2161,10 +2346,10 @@
             </a:solidFill>
             <a:effectLst/>
             <a:uFillTx/>
-            <a:latin typeface="Cambria"/>
-            <a:ea typeface="Cambria"/>
-            <a:cs typeface="Cambria"/>
-            <a:sym typeface="Cambria"/>
+            <a:latin typeface="+mn-lt"/>
+            <a:ea typeface="+mn-ea"/>
+            <a:cs typeface="+mn-cs"/>
+            <a:sym typeface="Helvetica Neue"/>
           </a:defRPr>
         </a:defPPr>
         <a:lvl1pPr marL="0" marR="0" indent="0" algn="l" defTabSz="914400" rtl="0" fontAlgn="auto" latinLnBrk="1" hangingPunct="0">
@@ -2420,9 +2605,9 @@
           <a:round/>
         </a:ln>
         <a:effectLst>
-          <a:outerShdw sx="100000" sy="100000" kx="0" ky="0" algn="b" rotWithShape="0" blurRad="38100" dist="20000" dir="5400000">
+          <a:outerShdw sx="100000" sy="100000" kx="0" ky="0" algn="b" rotWithShape="0" blurRad="38100" dist="23000" dir="5400000">
             <a:srgbClr val="000000">
-              <a:alpha val="38000"/>
+              <a:alpha val="35000"/>
             </a:srgbClr>
           </a:outerShdw>
         </a:effectLst>
@@ -2710,7 +2895,7 @@
         <a:effectLst/>
         <a:sp3d/>
       </a:spPr>
-      <a:bodyPr rot="0" spcFirstLastPara="1" vertOverflow="overflow" horzOverflow="overflow" vert="horz" wrap="square" lIns="45719" tIns="45719" rIns="45719" bIns="45719" numCol="1" spcCol="38100" rtlCol="0" anchor="t" upright="0">
+      <a:bodyPr rot="0" spcFirstLastPara="1" vertOverflow="overflow" horzOverflow="overflow" vert="horz" wrap="square" lIns="45718" tIns="45718" rIns="45718" bIns="45718" numCol="1" spcCol="38100" rtlCol="0" anchor="t" upright="0">
         <a:spAutoFit/>
       </a:bodyPr>
       <a:lstStyle>
@@ -2738,10 +2923,10 @@
             </a:solidFill>
             <a:effectLst/>
             <a:uFillTx/>
-            <a:latin typeface="Cambria"/>
-            <a:ea typeface="Cambria"/>
-            <a:cs typeface="Cambria"/>
-            <a:sym typeface="Cambria"/>
+            <a:latin typeface="+mn-lt"/>
+            <a:ea typeface="+mn-ea"/>
+            <a:cs typeface="+mn-cs"/>
+            <a:sym typeface="Helvetica Neue"/>
           </a:defRPr>
         </a:defPPr>
         <a:lvl1pPr marL="0" marR="0" indent="0" algn="l" defTabSz="914400" rtl="0" fontAlgn="auto" latinLnBrk="1" hangingPunct="0">

</xml_diff>

<commit_message>
Document resume build setup step
node_modules/ is untracked, so a fresh checkout fails with 'Cannot find
module docx' until the builders' dependency is installed.

Co-Authored-By: Claude Opus 5 <noreply@anthropic.com>
</commit_message>
<xml_diff>
--- a/public/travis-hoki-resume.docx
+++ b/public/travis-hoki-resume.docx
@@ -55,7 +55,7 @@
         </w:rPr>
         <w:t xml:space="preserve">  |  </w:t>
       </w:r>
-      <w:hyperlink w:history="1" r:id="rIdrf1tbawpbw4unxbujzgkr">
+      <w:hyperlink w:history="1" r:id="rIdzdrlg3qf4ttdf0oviflkj">
         <w:r>
           <w:rPr>
             <w:rFonts w:ascii="Arial" w:cs="Arial" w:eastAsia="Arial" w:hAnsi="Arial"/>
@@ -74,7 +74,7 @@
         </w:rPr>
         <w:t xml:space="preserve">  |  </w:t>
       </w:r>
-      <w:hyperlink w:history="1" r:id="rIdpqettg8uky6-zqupua6pz">
+      <w:hyperlink w:history="1" r:id="rIdcuvhh7boqgh-vjvp6-brw">
         <w:r>
           <w:rPr>
             <w:rFonts w:ascii="Arial" w:cs="Arial" w:eastAsia="Arial" w:hAnsi="Arial"/>
@@ -91,7 +91,7 @@
         <w:spacing w:after="160" w:line="264" w:lineRule="auto"/>
         <w:jc w:val="center"/>
       </w:pPr>
-      <w:hyperlink w:history="1" r:id="rIdaoofkajdb5msgtfjsezow">
+      <w:hyperlink w:history="1" r:id="rIdbpeiaco7u0ojwyddasr-p">
         <w:r>
           <w:rPr>
             <w:rFonts w:ascii="Arial" w:cs="Arial" w:eastAsia="Arial" w:hAnsi="Arial"/>
@@ -110,7 +110,7 @@
         </w:rPr>
         <w:t xml:space="preserve">  |  </w:t>
       </w:r>
-      <w:hyperlink w:history="1" r:id="rId6qbq58-vd8oc6l4z3ghnt">
+      <w:hyperlink w:history="1" r:id="rIduak5ypgp-3dpejau-y8yp">
         <w:r>
           <w:rPr>
             <w:rFonts w:ascii="Arial" w:cs="Arial" w:eastAsia="Arial" w:hAnsi="Arial"/>
@@ -129,7 +129,7 @@
         </w:rPr>
         <w:t xml:space="preserve">  |  </w:t>
       </w:r>
-      <w:hyperlink w:history="1" r:id="rId6luiaitd7uf1ywdcw7d-w">
+      <w:hyperlink w:history="1" r:id="rIdyhqyovjxhmmm3txeyie75">
         <w:r>
           <w:rPr>
             <w:rFonts w:ascii="Arial" w:cs="Arial" w:eastAsia="Arial" w:hAnsi="Arial"/>
@@ -1268,7 +1268,7 @@
       <w:pPr>
         <w:spacing w:after="20" w:before="120" w:line="264" w:lineRule="auto"/>
       </w:pPr>
-      <w:hyperlink w:history="1" r:id="rIdbevuckgybpmnyvy-bawxf">
+      <w:hyperlink w:history="1" r:id="rIdazyrr4lbmftjjcprbbk3k">
         <w:r>
           <w:rPr>
             <w:rFonts w:ascii="Arial" w:cs="Arial" w:eastAsia="Arial" w:hAnsi="Arial"/>
@@ -1301,7 +1301,7 @@
         </w:rPr>
         <w:t xml:space="preserve">  |  </w:t>
       </w:r>
-      <w:hyperlink w:history="1" r:id="rIdwvdaoqmaffvntkpu5pt98">
+      <w:hyperlink w:history="1" r:id="rIdbwqorafy0h9061lnqladi">
         <w:r>
           <w:rPr>
             <w:rFonts w:ascii="Arial" w:cs="Arial" w:eastAsia="Arial" w:hAnsi="Arial"/>
@@ -1330,7 +1330,7 @@
       <w:pPr>
         <w:spacing w:after="20" w:before="120" w:line="264" w:lineRule="auto"/>
       </w:pPr>
-      <w:hyperlink w:history="1" r:id="rIdp5m5hmxrkyhqwqjlnbyft">
+      <w:hyperlink w:history="1" r:id="rIdsjk-av4h4dr0menrg6fsn">
         <w:r>
           <w:rPr>
             <w:rFonts w:ascii="Arial" w:cs="Arial" w:eastAsia="Arial" w:hAnsi="Arial"/>
@@ -1363,7 +1363,7 @@
         </w:rPr>
         <w:t xml:space="preserve">  |  </w:t>
       </w:r>
-      <w:hyperlink w:history="1" r:id="rIdfmmu0fgnosbjhjzjh86o_">
+      <w:hyperlink w:history="1" r:id="rIdrvur2yjtktl0e9sly8aey">
         <w:r>
           <w:rPr>
             <w:rFonts w:ascii="Arial" w:cs="Arial" w:eastAsia="Arial" w:hAnsi="Arial"/>
@@ -1392,7 +1392,7 @@
       <w:pPr>
         <w:spacing w:after="20" w:before="120" w:line="264" w:lineRule="auto"/>
       </w:pPr>
-      <w:hyperlink w:history="1" r:id="rIdqfiec1fetuwbk2nlnj_ap">
+      <w:hyperlink w:history="1" r:id="rIdepwzzo0exj49fh4waib5-">
         <w:r>
           <w:rPr>
             <w:rFonts w:ascii="Arial" w:cs="Arial" w:eastAsia="Arial" w:hAnsi="Arial"/>
@@ -1425,7 +1425,7 @@
         </w:rPr>
         <w:t xml:space="preserve">  |  </w:t>
       </w:r>
-      <w:hyperlink w:history="1" r:id="rIdqwgjl304k8nnqcr80gjnz">
+      <w:hyperlink w:history="1" r:id="rIdn4rjmrylzes21jezzwjlr">
         <w:r>
           <w:rPr>
             <w:rFonts w:ascii="Arial" w:cs="Arial" w:eastAsia="Arial" w:hAnsi="Arial"/>
@@ -1449,7 +1449,7 @@
         </w:rPr>
         <w:t xml:space="preserve">Designed, illustrated, and built a mobile game in React Native, shipping one codebase to iOS and Android as real native UI. Published on the </w:t>
       </w:r>
-      <w:hyperlink w:history="1" r:id="rIda9cj0idtmii3-broonj_q">
+      <w:hyperlink w:history="1" r:id="rIdxvoke7ptfjmrpdq2gbuwx">
         <w:r>
           <w:rPr>
             <w:rFonts w:ascii="Arial" w:cs="Arial" w:eastAsia="Arial" w:hAnsi="Arial"/>
@@ -1589,7 +1589,7 @@
       <w:pPr>
         <w:spacing w:after="20" w:before="120" w:line="264" w:lineRule="auto"/>
       </w:pPr>
-      <w:hyperlink w:history="1" r:id="rIdyyqj92bjzrtaliz2qxfmd">
+      <w:hyperlink w:history="1" r:id="rIdqqa4ojigjmfqzw0qdtgt_">
         <w:r>
           <w:rPr>
             <w:rFonts w:ascii="Arial" w:cs="Arial" w:eastAsia="Arial" w:hAnsi="Arial"/>
@@ -1622,7 +1622,7 @@
         </w:rPr>
         <w:t xml:space="preserve">  |  </w:t>
       </w:r>
-      <w:hyperlink w:history="1" r:id="rIdvshqjrii_fibjvggro7_j">
+      <w:hyperlink w:history="1" r:id="rIdwadc7x1mkvr7p7zc-_s8p">
         <w:r>
           <w:rPr>
             <w:rFonts w:ascii="Arial" w:cs="Arial" w:eastAsia="Arial" w:hAnsi="Arial"/>

</xml_diff>

<commit_message>
Rename skills heading to SKILLS & TOOLS for ATS parsing
Many ATS classify sections by canonical heading names and do not
recognize 'Tools & Stacks', which risks the skills block being dropped
from the structured profile recruiters search. 'Skills & Tools' keeps the
plainer framing while containing the word parsers look for.

Co-Authored-By: Claude Opus 5 <noreply@anthropic.com>
</commit_message>
<xml_diff>
--- a/public/travis-hoki-resume.docx
+++ b/public/travis-hoki-resume.docx
@@ -55,7 +55,7 @@
         </w:rPr>
         <w:t xml:space="preserve">  |  </w:t>
       </w:r>
-      <w:hyperlink w:history="1" r:id="rIdjq5vetbnutwiwv6hm_1w3">
+      <w:hyperlink w:history="1" r:id="rIdrvy36i_fxzvrdmbpetxaw">
         <w:r>
           <w:rPr>
             <w:rFonts w:ascii="Arial" w:cs="Arial" w:eastAsia="Arial" w:hAnsi="Arial"/>
@@ -74,7 +74,7 @@
         </w:rPr>
         <w:t xml:space="preserve">  |  </w:t>
       </w:r>
-      <w:hyperlink w:history="1" r:id="rIdskrmm_ifg0txgh904wn59">
+      <w:hyperlink w:history="1" r:id="rIdg7oqmv15slt9auwosluzw">
         <w:r>
           <w:rPr>
             <w:rFonts w:ascii="Arial" w:cs="Arial" w:eastAsia="Arial" w:hAnsi="Arial"/>
@@ -91,7 +91,7 @@
         <w:spacing w:after="160" w:line="264" w:lineRule="auto"/>
         <w:jc w:val="center"/>
       </w:pPr>
-      <w:hyperlink w:history="1" r:id="rIdv3qwt1cdym4ggcmv59o9d">
+      <w:hyperlink w:history="1" r:id="rIdwughijwibnxxd_dua4jnh">
         <w:r>
           <w:rPr>
             <w:rFonts w:ascii="Arial" w:cs="Arial" w:eastAsia="Arial" w:hAnsi="Arial"/>
@@ -110,7 +110,7 @@
         </w:rPr>
         <w:t xml:space="preserve">  |  </w:t>
       </w:r>
-      <w:hyperlink w:history="1" r:id="rIdktbybe2deuryxwxollc3r">
+      <w:hyperlink w:history="1" r:id="rIdnhh6calgmprahzqhbnwza">
         <w:r>
           <w:rPr>
             <w:rFonts w:ascii="Arial" w:cs="Arial" w:eastAsia="Arial" w:hAnsi="Arial"/>
@@ -129,7 +129,7 @@
         </w:rPr>
         <w:t xml:space="preserve">  |  </w:t>
       </w:r>
-      <w:hyperlink w:history="1" r:id="rIdtxdcymuphmm1h39cjvv-i">
+      <w:hyperlink w:history="1" r:id="rIdaqkxvgpyohqt6x86ytgp8">
         <w:r>
           <w:rPr>
             <w:rFonts w:ascii="Arial" w:cs="Arial" w:eastAsia="Arial" w:hAnsi="Arial"/>
@@ -189,7 +189,7 @@
           <w:sz w:val="22"/>
           <w:szCs w:val="22"/>
         </w:rPr>
-        <w:t xml:space="preserve">TOOLS &amp; STACKS</w:t>
+        <w:t xml:space="preserve">SKILLS &amp; TOOLS</w:t>
       </w:r>
     </w:p>
     <w:p>
@@ -1268,7 +1268,7 @@
       <w:pPr>
         <w:spacing w:after="20" w:before="120" w:line="264" w:lineRule="auto"/>
       </w:pPr>
-      <w:hyperlink w:history="1" r:id="rIdvds1zjulyoqb2doepi1f_">
+      <w:hyperlink w:history="1" r:id="rIdvwy4b4vgs2xzgm05y91nu">
         <w:r>
           <w:rPr>
             <w:rFonts w:ascii="Arial" w:cs="Arial" w:eastAsia="Arial" w:hAnsi="Arial"/>
@@ -1301,7 +1301,7 @@
         </w:rPr>
         <w:t xml:space="preserve">  |  </w:t>
       </w:r>
-      <w:hyperlink w:history="1" r:id="rIduledahz48_ejwzcpoahhf">
+      <w:hyperlink w:history="1" r:id="rIdewhhgkjtfwmrhc9pr3icx">
         <w:r>
           <w:rPr>
             <w:rFonts w:ascii="Arial" w:cs="Arial" w:eastAsia="Arial" w:hAnsi="Arial"/>
@@ -1330,7 +1330,7 @@
       <w:pPr>
         <w:spacing w:after="20" w:before="120" w:line="264" w:lineRule="auto"/>
       </w:pPr>
-      <w:hyperlink w:history="1" r:id="rIdrtdvdzfx2ewurqdzhsnz2">
+      <w:hyperlink w:history="1" r:id="rIdixi3rg0fglttnv6h-q2ba">
         <w:r>
           <w:rPr>
             <w:rFonts w:ascii="Arial" w:cs="Arial" w:eastAsia="Arial" w:hAnsi="Arial"/>
@@ -1363,7 +1363,7 @@
         </w:rPr>
         <w:t xml:space="preserve">  |  </w:t>
       </w:r>
-      <w:hyperlink w:history="1" r:id="rIdrag8whbcx95tw_euws1ya">
+      <w:hyperlink w:history="1" r:id="rIdrhkjhefgzq0ucxgn_z9yo">
         <w:r>
           <w:rPr>
             <w:rFonts w:ascii="Arial" w:cs="Arial" w:eastAsia="Arial" w:hAnsi="Arial"/>
@@ -1392,7 +1392,7 @@
       <w:pPr>
         <w:spacing w:after="20" w:before="120" w:line="264" w:lineRule="auto"/>
       </w:pPr>
-      <w:hyperlink w:history="1" r:id="rIdpfzbveml-opkbsngggjdt">
+      <w:hyperlink w:history="1" r:id="rIdqwjh5zuf7yaaa7p9elrem">
         <w:r>
           <w:rPr>
             <w:rFonts w:ascii="Arial" w:cs="Arial" w:eastAsia="Arial" w:hAnsi="Arial"/>
@@ -1425,7 +1425,7 @@
         </w:rPr>
         <w:t xml:space="preserve">  |  </w:t>
       </w:r>
-      <w:hyperlink w:history="1" r:id="rIdohwpzduflvg2iatflqu3b">
+      <w:hyperlink w:history="1" r:id="rIdrneroekoa9ouc1yld07fy">
         <w:r>
           <w:rPr>
             <w:rFonts w:ascii="Arial" w:cs="Arial" w:eastAsia="Arial" w:hAnsi="Arial"/>
@@ -1449,7 +1449,7 @@
         </w:rPr>
         <w:t xml:space="preserve">Designed, illustrated, and built a mobile game in React Native, shipping one codebase to iOS and Android as real native UI. Published on the </w:t>
       </w:r>
-      <w:hyperlink w:history="1" r:id="rIdis578eoozgvxwgp0khcov">
+      <w:hyperlink w:history="1" r:id="rIdbw7hmjrakj2huk8r2-rxk">
         <w:r>
           <w:rPr>
             <w:rFonts w:ascii="Arial" w:cs="Arial" w:eastAsia="Arial" w:hAnsi="Arial"/>
@@ -1589,7 +1589,7 @@
       <w:pPr>
         <w:spacing w:after="20" w:before="120" w:line="264" w:lineRule="auto"/>
       </w:pPr>
-      <w:hyperlink w:history="1" r:id="rIdavhoew86zh8ixxddlgnmf">
+      <w:hyperlink w:history="1" r:id="rIdjlksvqcjrlpl5mlfz7ckc">
         <w:r>
           <w:rPr>
             <w:rFonts w:ascii="Arial" w:cs="Arial" w:eastAsia="Arial" w:hAnsi="Arial"/>
@@ -1622,7 +1622,7 @@
         </w:rPr>
         <w:t xml:space="preserve">  |  </w:t>
       </w:r>
-      <w:hyperlink w:history="1" r:id="rIdts8fnyuto_delynor99rj">
+      <w:hyperlink w:history="1" r:id="rIdj8jam-lo78zeclyzdjtem">
         <w:r>
           <w:rPr>
             <w:rFonts w:ascii="Arial" w:cs="Arial" w:eastAsia="Arial" w:hAnsi="Arial"/>

</xml_diff>

<commit_message>
Rebuild resume after Pages render test
Co-Authored-By: Claude Opus 5 <noreply@anthropic.com>
</commit_message>
<xml_diff>
--- a/public/travis-hoki-resume.docx
+++ b/public/travis-hoki-resume.docx
@@ -55,7 +55,7 @@
         </w:rPr>
         <w:t xml:space="preserve">  |  </w:t>
       </w:r>
-      <w:hyperlink w:history="1" r:id="rIdrvy36i_fxzvrdmbpetxaw">
+      <w:hyperlink w:history="1" r:id="rIdzramuztf99bkajjnizd_1">
         <w:r>
           <w:rPr>
             <w:rFonts w:ascii="Arial" w:cs="Arial" w:eastAsia="Arial" w:hAnsi="Arial"/>
@@ -74,7 +74,7 @@
         </w:rPr>
         <w:t xml:space="preserve">  |  </w:t>
       </w:r>
-      <w:hyperlink w:history="1" r:id="rIdg7oqmv15slt9auwosluzw">
+      <w:hyperlink w:history="1" r:id="rIdtnmgcbhipjjwdun1yrszw">
         <w:r>
           <w:rPr>
             <w:rFonts w:ascii="Arial" w:cs="Arial" w:eastAsia="Arial" w:hAnsi="Arial"/>
@@ -91,7 +91,7 @@
         <w:spacing w:after="160" w:line="264" w:lineRule="auto"/>
         <w:jc w:val="center"/>
       </w:pPr>
-      <w:hyperlink w:history="1" r:id="rIdwughijwibnxxd_dua4jnh">
+      <w:hyperlink w:history="1" r:id="rIdmvgyjka12kndqg5vsvrgn">
         <w:r>
           <w:rPr>
             <w:rFonts w:ascii="Arial" w:cs="Arial" w:eastAsia="Arial" w:hAnsi="Arial"/>
@@ -110,7 +110,7 @@
         </w:rPr>
         <w:t xml:space="preserve">  |  </w:t>
       </w:r>
-      <w:hyperlink w:history="1" r:id="rIdnhh6calgmprahzqhbnwza">
+      <w:hyperlink w:history="1" r:id="rIdc4_ic9lkwksbkiowzhmq3">
         <w:r>
           <w:rPr>
             <w:rFonts w:ascii="Arial" w:cs="Arial" w:eastAsia="Arial" w:hAnsi="Arial"/>
@@ -129,7 +129,7 @@
         </w:rPr>
         <w:t xml:space="preserve">  |  </w:t>
       </w:r>
-      <w:hyperlink w:history="1" r:id="rIdaqkxvgpyohqt6x86ytgp8">
+      <w:hyperlink w:history="1" r:id="rIdpqklflw2riktsvdubgfax">
         <w:r>
           <w:rPr>
             <w:rFonts w:ascii="Arial" w:cs="Arial" w:eastAsia="Arial" w:hAnsi="Arial"/>
@@ -1268,7 +1268,7 @@
       <w:pPr>
         <w:spacing w:after="20" w:before="120" w:line="264" w:lineRule="auto"/>
       </w:pPr>
-      <w:hyperlink w:history="1" r:id="rIdvwy4b4vgs2xzgm05y91nu">
+      <w:hyperlink w:history="1" r:id="rIdfllcazfe3k0us3hiun99q">
         <w:r>
           <w:rPr>
             <w:rFonts w:ascii="Arial" w:cs="Arial" w:eastAsia="Arial" w:hAnsi="Arial"/>
@@ -1301,7 +1301,7 @@
         </w:rPr>
         <w:t xml:space="preserve">  |  </w:t>
       </w:r>
-      <w:hyperlink w:history="1" r:id="rIdewhhgkjtfwmrhc9pr3icx">
+      <w:hyperlink w:history="1" r:id="rIdefeozkt9u7tc3daq60l-n">
         <w:r>
           <w:rPr>
             <w:rFonts w:ascii="Arial" w:cs="Arial" w:eastAsia="Arial" w:hAnsi="Arial"/>
@@ -1330,7 +1330,7 @@
       <w:pPr>
         <w:spacing w:after="20" w:before="120" w:line="264" w:lineRule="auto"/>
       </w:pPr>
-      <w:hyperlink w:history="1" r:id="rIdixi3rg0fglttnv6h-q2ba">
+      <w:hyperlink w:history="1" r:id="rIdmdnucsxktz21w4xmepbnx">
         <w:r>
           <w:rPr>
             <w:rFonts w:ascii="Arial" w:cs="Arial" w:eastAsia="Arial" w:hAnsi="Arial"/>
@@ -1363,7 +1363,7 @@
         </w:rPr>
         <w:t xml:space="preserve">  |  </w:t>
       </w:r>
-      <w:hyperlink w:history="1" r:id="rIdrhkjhefgzq0ucxgn_z9yo">
+      <w:hyperlink w:history="1" r:id="rIdilz2fermn859taijwyqsd">
         <w:r>
           <w:rPr>
             <w:rFonts w:ascii="Arial" w:cs="Arial" w:eastAsia="Arial" w:hAnsi="Arial"/>
@@ -1392,7 +1392,7 @@
       <w:pPr>
         <w:spacing w:after="20" w:before="120" w:line="264" w:lineRule="auto"/>
       </w:pPr>
-      <w:hyperlink w:history="1" r:id="rIdqwjh5zuf7yaaa7p9elrem">
+      <w:hyperlink w:history="1" r:id="rId37qmizmf1wcea05suddcw">
         <w:r>
           <w:rPr>
             <w:rFonts w:ascii="Arial" w:cs="Arial" w:eastAsia="Arial" w:hAnsi="Arial"/>
@@ -1425,7 +1425,7 @@
         </w:rPr>
         <w:t xml:space="preserve">  |  </w:t>
       </w:r>
-      <w:hyperlink w:history="1" r:id="rIdrneroekoa9ouc1yld07fy">
+      <w:hyperlink w:history="1" r:id="rIdckxitkvxt7rgs01pnfrot">
         <w:r>
           <w:rPr>
             <w:rFonts w:ascii="Arial" w:cs="Arial" w:eastAsia="Arial" w:hAnsi="Arial"/>
@@ -1449,7 +1449,7 @@
         </w:rPr>
         <w:t xml:space="preserve">Designed, illustrated, and built a mobile game in React Native, shipping one codebase to iOS and Android as real native UI. Published on the </w:t>
       </w:r>
-      <w:hyperlink w:history="1" r:id="rIdbw7hmjrakj2huk8r2-rxk">
+      <w:hyperlink w:history="1" r:id="rIduzst7k3eagfk_-xoyio5l">
         <w:r>
           <w:rPr>
             <w:rFonts w:ascii="Arial" w:cs="Arial" w:eastAsia="Arial" w:hAnsi="Arial"/>
@@ -1589,7 +1589,7 @@
       <w:pPr>
         <w:spacing w:after="20" w:before="120" w:line="264" w:lineRule="auto"/>
       </w:pPr>
-      <w:hyperlink w:history="1" r:id="rIdjlksvqcjrlpl5mlfz7ckc">
+      <w:hyperlink w:history="1" r:id="rIdmwsv6rn2jgvl40iqnrr4h">
         <w:r>
           <w:rPr>
             <w:rFonts w:ascii="Arial" w:cs="Arial" w:eastAsia="Arial" w:hAnsi="Arial"/>
@@ -1622,7 +1622,7 @@
         </w:rPr>
         <w:t xml:space="preserve">  |  </w:t>
       </w:r>
-      <w:hyperlink w:history="1" r:id="rIdj8jam-lo78zeclyzdjtem">
+      <w:hyperlink w:history="1" r:id="rId59b7hsy9iavxcjl8zj75n">
         <w:r>
           <w:rPr>
             <w:rFonts w:ascii="Arial" w:cs="Arial" w:eastAsia="Arial" w:hAnsi="Arial"/>

</xml_diff>

<commit_message>
Fix docx heading rules and header centering in Pages
Pages ignores direct paragraph formatting on unstyled paragraphs, so the
centered header and the navy rules under each section heading were both
being dropped. The original resume styled every paragraph; this now does
the same, with the rule carried by a named SectionHeading style.

Spacing is slightly tighter than the PDF's CSS because Pages honours the
docx values once paragraphs are styled, which otherwise spilled a line
onto a third page.

Co-Authored-By: Claude Opus 5 <noreply@anthropic.com>
</commit_message>
<xml_diff>
--- a/public/travis-hoki-resume.docx
+++ b/public/travis-hoki-resume.docx
@@ -4,7 +4,8 @@
   <w:body>
     <w:p>
       <w:pPr>
-        <w:spacing w:after="20" w:line="264" w:lineRule="auto"/>
+        <w:pStyle w:val="Normal"/>
+        <w:spacing w:after="20" w:line="240" w:lineRule="auto"/>
         <w:jc w:val="center"/>
       </w:pPr>
       <w:r>
@@ -21,7 +22,8 @@
     </w:p>
     <w:p>
       <w:pPr>
-        <w:spacing w:after="60" w:line="264" w:lineRule="auto"/>
+        <w:pStyle w:val="Normal"/>
+        <w:spacing w:after="60" w:line="240" w:lineRule="auto"/>
         <w:jc w:val="center"/>
       </w:pPr>
       <w:r>
@@ -36,7 +38,8 @@
     </w:p>
     <w:p>
       <w:pPr>
-        <w:spacing w:after="20" w:line="264" w:lineRule="auto"/>
+        <w:pStyle w:val="Normal"/>
+        <w:spacing w:after="20" w:line="240" w:lineRule="auto"/>
         <w:jc w:val="center"/>
       </w:pPr>
       <w:r>
@@ -55,7 +58,7 @@
         </w:rPr>
         <w:t xml:space="preserve">  |  </w:t>
       </w:r>
-      <w:hyperlink w:history="1" r:id="rIdzramuztf99bkajjnizd_1">
+      <w:hyperlink w:history="1" r:id="rIdixhzddrd9om-b9rsgfh4z">
         <w:r>
           <w:rPr>
             <w:rFonts w:ascii="Arial" w:cs="Arial" w:eastAsia="Arial" w:hAnsi="Arial"/>
@@ -74,7 +77,7 @@
         </w:rPr>
         <w:t xml:space="preserve">  |  </w:t>
       </w:r>
-      <w:hyperlink w:history="1" r:id="rIdtnmgcbhipjjwdun1yrszw">
+      <w:hyperlink w:history="1" r:id="rIdwgjfthvnpjoshcyw9_ckj">
         <w:r>
           <w:rPr>
             <w:rFonts w:ascii="Arial" w:cs="Arial" w:eastAsia="Arial" w:hAnsi="Arial"/>
@@ -88,10 +91,11 @@
     </w:p>
     <w:p>
       <w:pPr>
-        <w:spacing w:after="160" w:line="264" w:lineRule="auto"/>
+        <w:pStyle w:val="Normal"/>
+        <w:spacing w:after="160" w:line="240" w:lineRule="auto"/>
         <w:jc w:val="center"/>
       </w:pPr>
-      <w:hyperlink w:history="1" r:id="rIdmvgyjka12kndqg5vsvrgn">
+      <w:hyperlink w:history="1" r:id="rIdewrxay7hbjmw3wpqn3k2c">
         <w:r>
           <w:rPr>
             <w:rFonts w:ascii="Arial" w:cs="Arial" w:eastAsia="Arial" w:hAnsi="Arial"/>
@@ -110,7 +114,7 @@
         </w:rPr>
         <w:t xml:space="preserve">  |  </w:t>
       </w:r>
-      <w:hyperlink w:history="1" r:id="rIdc4_ic9lkwksbkiowzhmq3">
+      <w:hyperlink w:history="1" r:id="rIdzrkliftsbw8x5hok_hofu">
         <w:r>
           <w:rPr>
             <w:rFonts w:ascii="Arial" w:cs="Arial" w:eastAsia="Arial" w:hAnsi="Arial"/>
@@ -129,7 +133,7 @@
         </w:rPr>
         <w:t xml:space="preserve">  |  </w:t>
       </w:r>
-      <w:hyperlink w:history="1" r:id="rIdpqklflw2riktsvdubgfax">
+      <w:hyperlink w:history="1" r:id="rIdes8nnatzfkb5mbcgcdf5n">
         <w:r>
           <w:rPr>
             <w:rFonts w:ascii="Arial" w:cs="Arial" w:eastAsia="Arial" w:hAnsi="Arial"/>
@@ -143,10 +147,8 @@
     </w:p>
     <w:p>
       <w:pPr>
-        <w:pBdr>
-          <w:bottom w:val="single" w:color="1F4E79" w:sz="4" w:space="0"/>
-        </w:pBdr>
-        <w:spacing w:after="60" w:before="160" w:line="264" w:lineRule="auto"/>
+        <w:pStyle w:val="SectionHeading"/>
+        <w:spacing w:after="50" w:before="120" w:line="240" w:lineRule="auto"/>
       </w:pPr>
       <w:r>
         <w:rPr>
@@ -162,7 +164,8 @@
     </w:p>
     <w:p>
       <w:pPr>
-        <w:spacing w:after="80" w:before="20" w:line="264" w:lineRule="auto"/>
+        <w:pStyle w:val="Normal"/>
+        <w:spacing w:after="50" w:before="20" w:line="240" w:lineRule="auto"/>
       </w:pPr>
       <w:r>
         <w:rPr>
@@ -175,10 +178,8 @@
     </w:p>
     <w:p>
       <w:pPr>
-        <w:pBdr>
-          <w:bottom w:val="single" w:color="1F4E79" w:sz="4" w:space="0"/>
-        </w:pBdr>
-        <w:spacing w:after="60" w:before="160" w:line="264" w:lineRule="auto"/>
+        <w:pStyle w:val="SectionHeading"/>
+        <w:spacing w:after="50" w:before="120" w:line="240" w:lineRule="auto"/>
       </w:pPr>
       <w:r>
         <w:rPr>
@@ -194,12 +195,12 @@
     </w:p>
     <w:p>
       <w:pPr>
-        <w:pStyle w:val="ListParagraph"/>
-        <w:numPr>
-          <w:ilvl w:val="0"/>
-          <w:numId w:val="2"/>
-        </w:numPr>
-        <w:spacing w:after="40" w:line="264" w:lineRule="auto"/>
+        <w:pStyle w:val="Normal"/>
+        <w:numPr>
+          <w:ilvl w:val="0"/>
+          <w:numId w:val="2"/>
+        </w:numPr>
+        <w:spacing w:after="40" w:line="240" w:lineRule="auto"/>
       </w:pPr>
       <w:r>
         <w:rPr>
@@ -222,12 +223,12 @@
     </w:p>
     <w:p>
       <w:pPr>
-        <w:pStyle w:val="ListParagraph"/>
-        <w:numPr>
-          <w:ilvl w:val="0"/>
-          <w:numId w:val="2"/>
-        </w:numPr>
-        <w:spacing w:after="40" w:line="264" w:lineRule="auto"/>
+        <w:pStyle w:val="Normal"/>
+        <w:numPr>
+          <w:ilvl w:val="0"/>
+          <w:numId w:val="2"/>
+        </w:numPr>
+        <w:spacing w:after="40" w:line="240" w:lineRule="auto"/>
       </w:pPr>
       <w:r>
         <w:rPr>
@@ -250,12 +251,12 @@
     </w:p>
     <w:p>
       <w:pPr>
-        <w:pStyle w:val="ListParagraph"/>
-        <w:numPr>
-          <w:ilvl w:val="0"/>
-          <w:numId w:val="2"/>
-        </w:numPr>
-        <w:spacing w:after="40" w:line="264" w:lineRule="auto"/>
+        <w:pStyle w:val="Normal"/>
+        <w:numPr>
+          <w:ilvl w:val="0"/>
+          <w:numId w:val="2"/>
+        </w:numPr>
+        <w:spacing w:after="40" w:line="240" w:lineRule="auto"/>
       </w:pPr>
       <w:r>
         <w:rPr>
@@ -278,12 +279,12 @@
     </w:p>
     <w:p>
       <w:pPr>
-        <w:pStyle w:val="ListParagraph"/>
-        <w:numPr>
-          <w:ilvl w:val="0"/>
-          <w:numId w:val="2"/>
-        </w:numPr>
-        <w:spacing w:after="40" w:line="264" w:lineRule="auto"/>
+        <w:pStyle w:val="Normal"/>
+        <w:numPr>
+          <w:ilvl w:val="0"/>
+          <w:numId w:val="2"/>
+        </w:numPr>
+        <w:spacing w:after="40" w:line="240" w:lineRule="auto"/>
       </w:pPr>
       <w:r>
         <w:rPr>
@@ -306,12 +307,12 @@
     </w:p>
     <w:p>
       <w:pPr>
-        <w:pStyle w:val="ListParagraph"/>
-        <w:numPr>
-          <w:ilvl w:val="0"/>
-          <w:numId w:val="2"/>
-        </w:numPr>
-        <w:spacing w:after="40" w:line="264" w:lineRule="auto"/>
+        <w:pStyle w:val="Normal"/>
+        <w:numPr>
+          <w:ilvl w:val="0"/>
+          <w:numId w:val="2"/>
+        </w:numPr>
+        <w:spacing w:after="40" w:line="240" w:lineRule="auto"/>
       </w:pPr>
       <w:r>
         <w:rPr>
@@ -334,12 +335,12 @@
     </w:p>
     <w:p>
       <w:pPr>
-        <w:pStyle w:val="ListParagraph"/>
-        <w:numPr>
-          <w:ilvl w:val="0"/>
-          <w:numId w:val="2"/>
-        </w:numPr>
-        <w:spacing w:after="40" w:line="264" w:lineRule="auto"/>
+        <w:pStyle w:val="Normal"/>
+        <w:numPr>
+          <w:ilvl w:val="0"/>
+          <w:numId w:val="2"/>
+        </w:numPr>
+        <w:spacing w:after="40" w:line="240" w:lineRule="auto"/>
       </w:pPr>
       <w:r>
         <w:rPr>
@@ -362,10 +363,8 @@
     </w:p>
     <w:p>
       <w:pPr>
-        <w:pBdr>
-          <w:bottom w:val="single" w:color="1F4E79" w:sz="4" w:space="0"/>
-        </w:pBdr>
-        <w:spacing w:after="60" w:before="160" w:line="264" w:lineRule="auto"/>
+        <w:pStyle w:val="SectionHeading"/>
+        <w:spacing w:after="50" w:before="120" w:line="240" w:lineRule="auto"/>
       </w:pPr>
       <w:r>
         <w:rPr>
@@ -381,7 +380,8 @@
     </w:p>
     <w:p>
       <w:pPr>
-        <w:spacing w:after="20" w:before="140" w:line="264" w:lineRule="auto"/>
+        <w:pStyle w:val="Normal"/>
+        <w:spacing w:after="20" w:before="140" w:line="240" w:lineRule="auto"/>
       </w:pPr>
       <w:r>
         <w:rPr>
@@ -426,7 +426,8 @@
     </w:p>
     <w:p>
       <w:pPr>
-        <w:spacing w:after="50" w:line="264" w:lineRule="auto"/>
+        <w:pStyle w:val="Normal"/>
+        <w:spacing w:after="50" w:line="240" w:lineRule="auto"/>
       </w:pPr>
       <w:r>
         <w:rPr>
@@ -442,12 +443,12 @@
     </w:p>
     <w:p>
       <w:pPr>
-        <w:pStyle w:val="ListParagraph"/>
-        <w:numPr>
-          <w:ilvl w:val="0"/>
-          <w:numId w:val="2"/>
-        </w:numPr>
-        <w:spacing w:after="40" w:line="264" w:lineRule="auto"/>
+        <w:pStyle w:val="Normal"/>
+        <w:numPr>
+          <w:ilvl w:val="0"/>
+          <w:numId w:val="2"/>
+        </w:numPr>
+        <w:spacing w:after="20" w:line="240" w:lineRule="auto"/>
       </w:pPr>
       <w:r>
         <w:rPr>
@@ -460,12 +461,12 @@
     </w:p>
     <w:p>
       <w:pPr>
-        <w:pStyle w:val="ListParagraph"/>
-        <w:numPr>
-          <w:ilvl w:val="0"/>
-          <w:numId w:val="2"/>
-        </w:numPr>
-        <w:spacing w:after="40" w:line="264" w:lineRule="auto"/>
+        <w:pStyle w:val="Normal"/>
+        <w:numPr>
+          <w:ilvl w:val="0"/>
+          <w:numId w:val="2"/>
+        </w:numPr>
+        <w:spacing w:after="20" w:line="240" w:lineRule="auto"/>
       </w:pPr>
       <w:r>
         <w:rPr>
@@ -478,12 +479,12 @@
     </w:p>
     <w:p>
       <w:pPr>
-        <w:pStyle w:val="ListParagraph"/>
-        <w:numPr>
-          <w:ilvl w:val="0"/>
-          <w:numId w:val="2"/>
-        </w:numPr>
-        <w:spacing w:after="40" w:line="264" w:lineRule="auto"/>
+        <w:pStyle w:val="Normal"/>
+        <w:numPr>
+          <w:ilvl w:val="0"/>
+          <w:numId w:val="2"/>
+        </w:numPr>
+        <w:spacing w:after="20" w:line="240" w:lineRule="auto"/>
       </w:pPr>
       <w:r>
         <w:rPr>
@@ -496,7 +497,8 @@
     </w:p>
     <w:p>
       <w:pPr>
-        <w:spacing w:after="20" w:before="140" w:line="264" w:lineRule="auto"/>
+        <w:pStyle w:val="Normal"/>
+        <w:spacing w:after="20" w:before="140" w:line="240" w:lineRule="auto"/>
       </w:pPr>
       <w:r>
         <w:rPr>
@@ -552,7 +554,8 @@
     </w:p>
     <w:p>
       <w:pPr>
-        <w:spacing w:after="50" w:line="264" w:lineRule="auto"/>
+        <w:pStyle w:val="Normal"/>
+        <w:spacing w:after="50" w:line="240" w:lineRule="auto"/>
       </w:pPr>
       <w:r>
         <w:rPr>
@@ -568,12 +571,12 @@
     </w:p>
     <w:p>
       <w:pPr>
-        <w:pStyle w:val="ListParagraph"/>
-        <w:numPr>
-          <w:ilvl w:val="0"/>
-          <w:numId w:val="2"/>
-        </w:numPr>
-        <w:spacing w:after="40" w:line="264" w:lineRule="auto"/>
+        <w:pStyle w:val="Normal"/>
+        <w:numPr>
+          <w:ilvl w:val="0"/>
+          <w:numId w:val="2"/>
+        </w:numPr>
+        <w:spacing w:after="20" w:line="240" w:lineRule="auto"/>
       </w:pPr>
       <w:r>
         <w:rPr>
@@ -586,12 +589,12 @@
     </w:p>
     <w:p>
       <w:pPr>
-        <w:pStyle w:val="ListParagraph"/>
-        <w:numPr>
-          <w:ilvl w:val="0"/>
-          <w:numId w:val="2"/>
-        </w:numPr>
-        <w:spacing w:after="40" w:line="264" w:lineRule="auto"/>
+        <w:pStyle w:val="Normal"/>
+        <w:numPr>
+          <w:ilvl w:val="0"/>
+          <w:numId w:val="2"/>
+        </w:numPr>
+        <w:spacing w:after="20" w:line="240" w:lineRule="auto"/>
       </w:pPr>
       <w:r>
         <w:rPr>
@@ -604,12 +607,12 @@
     </w:p>
     <w:p>
       <w:pPr>
-        <w:pStyle w:val="ListParagraph"/>
-        <w:numPr>
-          <w:ilvl w:val="0"/>
-          <w:numId w:val="2"/>
-        </w:numPr>
-        <w:spacing w:after="40" w:line="264" w:lineRule="auto"/>
+        <w:pStyle w:val="Normal"/>
+        <w:numPr>
+          <w:ilvl w:val="0"/>
+          <w:numId w:val="2"/>
+        </w:numPr>
+        <w:spacing w:after="20" w:line="240" w:lineRule="auto"/>
       </w:pPr>
       <w:r>
         <w:rPr>
@@ -622,12 +625,12 @@
     </w:p>
     <w:p>
       <w:pPr>
-        <w:pStyle w:val="ListParagraph"/>
-        <w:numPr>
-          <w:ilvl w:val="0"/>
-          <w:numId w:val="2"/>
-        </w:numPr>
-        <w:spacing w:after="40" w:line="264" w:lineRule="auto"/>
+        <w:pStyle w:val="Normal"/>
+        <w:numPr>
+          <w:ilvl w:val="0"/>
+          <w:numId w:val="2"/>
+        </w:numPr>
+        <w:spacing w:after="20" w:line="240" w:lineRule="auto"/>
       </w:pPr>
       <w:r>
         <w:rPr>
@@ -640,12 +643,12 @@
     </w:p>
     <w:p>
       <w:pPr>
-        <w:pStyle w:val="ListParagraph"/>
-        <w:numPr>
-          <w:ilvl w:val="0"/>
-          <w:numId w:val="2"/>
-        </w:numPr>
-        <w:spacing w:after="40" w:line="264" w:lineRule="auto"/>
+        <w:pStyle w:val="Normal"/>
+        <w:numPr>
+          <w:ilvl w:val="0"/>
+          <w:numId w:val="2"/>
+        </w:numPr>
+        <w:spacing w:after="20" w:line="240" w:lineRule="auto"/>
       </w:pPr>
       <w:r>
         <w:rPr>
@@ -658,7 +661,8 @@
     </w:p>
     <w:p>
       <w:pPr>
-        <w:spacing w:after="20" w:before="140" w:line="264" w:lineRule="auto"/>
+        <w:pStyle w:val="Normal"/>
+        <w:spacing w:after="20" w:before="140" w:line="240" w:lineRule="auto"/>
       </w:pPr>
       <w:r>
         <w:rPr>
@@ -714,12 +718,12 @@
     </w:p>
     <w:p>
       <w:pPr>
-        <w:pStyle w:val="ListParagraph"/>
-        <w:numPr>
-          <w:ilvl w:val="0"/>
-          <w:numId w:val="2"/>
-        </w:numPr>
-        <w:spacing w:after="40" w:line="264" w:lineRule="auto"/>
+        <w:pStyle w:val="Normal"/>
+        <w:numPr>
+          <w:ilvl w:val="0"/>
+          <w:numId w:val="2"/>
+        </w:numPr>
+        <w:spacing w:after="20" w:line="240" w:lineRule="auto"/>
       </w:pPr>
       <w:r>
         <w:rPr>
@@ -732,12 +736,12 @@
     </w:p>
     <w:p>
       <w:pPr>
-        <w:pStyle w:val="ListParagraph"/>
-        <w:numPr>
-          <w:ilvl w:val="0"/>
-          <w:numId w:val="2"/>
-        </w:numPr>
-        <w:spacing w:after="40" w:line="264" w:lineRule="auto"/>
+        <w:pStyle w:val="Normal"/>
+        <w:numPr>
+          <w:ilvl w:val="0"/>
+          <w:numId w:val="2"/>
+        </w:numPr>
+        <w:spacing w:after="20" w:line="240" w:lineRule="auto"/>
       </w:pPr>
       <w:r>
         <w:rPr>
@@ -750,12 +754,12 @@
     </w:p>
     <w:p>
       <w:pPr>
-        <w:pStyle w:val="ListParagraph"/>
-        <w:numPr>
-          <w:ilvl w:val="0"/>
-          <w:numId w:val="2"/>
-        </w:numPr>
-        <w:spacing w:after="40" w:line="264" w:lineRule="auto"/>
+        <w:pStyle w:val="Normal"/>
+        <w:numPr>
+          <w:ilvl w:val="0"/>
+          <w:numId w:val="2"/>
+        </w:numPr>
+        <w:spacing w:after="20" w:line="240" w:lineRule="auto"/>
       </w:pPr>
       <w:r>
         <w:rPr>
@@ -768,7 +772,8 @@
     </w:p>
     <w:p>
       <w:pPr>
-        <w:spacing w:after="20" w:before="140" w:line="264" w:lineRule="auto"/>
+        <w:pStyle w:val="Normal"/>
+        <w:spacing w:after="20" w:before="140" w:line="240" w:lineRule="auto"/>
       </w:pPr>
       <w:r>
         <w:rPr>
@@ -813,12 +818,12 @@
     </w:p>
     <w:p>
       <w:pPr>
-        <w:pStyle w:val="ListParagraph"/>
-        <w:numPr>
-          <w:ilvl w:val="0"/>
-          <w:numId w:val="2"/>
-        </w:numPr>
-        <w:spacing w:after="40" w:line="264" w:lineRule="auto"/>
+        <w:pStyle w:val="Normal"/>
+        <w:numPr>
+          <w:ilvl w:val="0"/>
+          <w:numId w:val="2"/>
+        </w:numPr>
+        <w:spacing w:after="20" w:line="240" w:lineRule="auto"/>
       </w:pPr>
       <w:r>
         <w:rPr>
@@ -831,12 +836,12 @@
     </w:p>
     <w:p>
       <w:pPr>
-        <w:pStyle w:val="ListParagraph"/>
-        <w:numPr>
-          <w:ilvl w:val="0"/>
-          <w:numId w:val="2"/>
-        </w:numPr>
-        <w:spacing w:after="40" w:line="264" w:lineRule="auto"/>
+        <w:pStyle w:val="Normal"/>
+        <w:numPr>
+          <w:ilvl w:val="0"/>
+          <w:numId w:val="2"/>
+        </w:numPr>
+        <w:spacing w:after="20" w:line="240" w:lineRule="auto"/>
       </w:pPr>
       <w:r>
         <w:rPr>
@@ -849,12 +854,12 @@
     </w:p>
     <w:p>
       <w:pPr>
-        <w:pStyle w:val="ListParagraph"/>
-        <w:numPr>
-          <w:ilvl w:val="0"/>
-          <w:numId w:val="2"/>
-        </w:numPr>
-        <w:spacing w:after="40" w:line="264" w:lineRule="auto"/>
+        <w:pStyle w:val="Normal"/>
+        <w:numPr>
+          <w:ilvl w:val="0"/>
+          <w:numId w:val="2"/>
+        </w:numPr>
+        <w:spacing w:after="20" w:line="240" w:lineRule="auto"/>
       </w:pPr>
       <w:r>
         <w:rPr>
@@ -867,12 +872,12 @@
     </w:p>
     <w:p>
       <w:pPr>
-        <w:pStyle w:val="ListParagraph"/>
-        <w:numPr>
-          <w:ilvl w:val="0"/>
-          <w:numId w:val="2"/>
-        </w:numPr>
-        <w:spacing w:after="40" w:line="264" w:lineRule="auto"/>
+        <w:pStyle w:val="Normal"/>
+        <w:numPr>
+          <w:ilvl w:val="0"/>
+          <w:numId w:val="2"/>
+        </w:numPr>
+        <w:spacing w:after="20" w:line="240" w:lineRule="auto"/>
       </w:pPr>
       <w:r>
         <w:rPr>
@@ -885,7 +890,8 @@
     </w:p>
     <w:p>
       <w:pPr>
-        <w:spacing w:after="20" w:before="140" w:line="264" w:lineRule="auto"/>
+        <w:pStyle w:val="Normal"/>
+        <w:spacing w:after="20" w:before="140" w:line="240" w:lineRule="auto"/>
       </w:pPr>
       <w:r>
         <w:rPr>
@@ -941,12 +947,12 @@
     </w:p>
     <w:p>
       <w:pPr>
-        <w:pStyle w:val="ListParagraph"/>
-        <w:numPr>
-          <w:ilvl w:val="0"/>
-          <w:numId w:val="2"/>
-        </w:numPr>
-        <w:spacing w:after="40" w:line="264" w:lineRule="auto"/>
+        <w:pStyle w:val="Normal"/>
+        <w:numPr>
+          <w:ilvl w:val="0"/>
+          <w:numId w:val="2"/>
+        </w:numPr>
+        <w:spacing w:after="20" w:line="240" w:lineRule="auto"/>
       </w:pPr>
       <w:r>
         <w:rPr>
@@ -959,12 +965,12 @@
     </w:p>
     <w:p>
       <w:pPr>
-        <w:pStyle w:val="ListParagraph"/>
-        <w:numPr>
-          <w:ilvl w:val="0"/>
-          <w:numId w:val="2"/>
-        </w:numPr>
-        <w:spacing w:after="40" w:line="264" w:lineRule="auto"/>
+        <w:pStyle w:val="Normal"/>
+        <w:numPr>
+          <w:ilvl w:val="0"/>
+          <w:numId w:val="2"/>
+        </w:numPr>
+        <w:spacing w:after="20" w:line="240" w:lineRule="auto"/>
       </w:pPr>
       <w:r>
         <w:rPr>
@@ -977,12 +983,12 @@
     </w:p>
     <w:p>
       <w:pPr>
-        <w:pStyle w:val="ListParagraph"/>
-        <w:numPr>
-          <w:ilvl w:val="0"/>
-          <w:numId w:val="2"/>
-        </w:numPr>
-        <w:spacing w:after="40" w:line="264" w:lineRule="auto"/>
+        <w:pStyle w:val="Normal"/>
+        <w:numPr>
+          <w:ilvl w:val="0"/>
+          <w:numId w:val="2"/>
+        </w:numPr>
+        <w:spacing w:after="20" w:line="240" w:lineRule="auto"/>
       </w:pPr>
       <w:r>
         <w:rPr>
@@ -995,12 +1001,12 @@
     </w:p>
     <w:p>
       <w:pPr>
-        <w:pStyle w:val="ListParagraph"/>
-        <w:numPr>
-          <w:ilvl w:val="0"/>
-          <w:numId w:val="2"/>
-        </w:numPr>
-        <w:spacing w:after="40" w:line="264" w:lineRule="auto"/>
+        <w:pStyle w:val="Normal"/>
+        <w:numPr>
+          <w:ilvl w:val="0"/>
+          <w:numId w:val="2"/>
+        </w:numPr>
+        <w:spacing w:after="20" w:line="240" w:lineRule="auto"/>
       </w:pPr>
       <w:r>
         <w:rPr>
@@ -1013,12 +1019,12 @@
     </w:p>
     <w:p>
       <w:pPr>
-        <w:pStyle w:val="ListParagraph"/>
-        <w:numPr>
-          <w:ilvl w:val="0"/>
-          <w:numId w:val="2"/>
-        </w:numPr>
-        <w:spacing w:after="40" w:line="264" w:lineRule="auto"/>
+        <w:pStyle w:val="Normal"/>
+        <w:numPr>
+          <w:ilvl w:val="0"/>
+          <w:numId w:val="2"/>
+        </w:numPr>
+        <w:spacing w:after="20" w:line="240" w:lineRule="auto"/>
       </w:pPr>
       <w:r>
         <w:rPr>
@@ -1031,12 +1037,12 @@
     </w:p>
     <w:p>
       <w:pPr>
-        <w:pStyle w:val="ListParagraph"/>
-        <w:numPr>
-          <w:ilvl w:val="0"/>
-          <w:numId w:val="2"/>
-        </w:numPr>
-        <w:spacing w:after="40" w:line="264" w:lineRule="auto"/>
+        <w:pStyle w:val="Normal"/>
+        <w:numPr>
+          <w:ilvl w:val="0"/>
+          <w:numId w:val="2"/>
+        </w:numPr>
+        <w:spacing w:after="20" w:line="240" w:lineRule="auto"/>
       </w:pPr>
       <w:r>
         <w:rPr>
@@ -1049,7 +1055,8 @@
     </w:p>
     <w:p>
       <w:pPr>
-        <w:spacing w:after="20" w:before="140" w:line="264" w:lineRule="auto"/>
+        <w:pStyle w:val="Normal"/>
+        <w:spacing w:after="20" w:before="140" w:line="240" w:lineRule="auto"/>
       </w:pPr>
       <w:r>
         <w:rPr>
@@ -1094,12 +1101,12 @@
     </w:p>
     <w:p>
       <w:pPr>
-        <w:pStyle w:val="ListParagraph"/>
-        <w:numPr>
-          <w:ilvl w:val="0"/>
-          <w:numId w:val="2"/>
-        </w:numPr>
-        <w:spacing w:after="40" w:line="264" w:lineRule="auto"/>
+        <w:pStyle w:val="Normal"/>
+        <w:numPr>
+          <w:ilvl w:val="0"/>
+          <w:numId w:val="2"/>
+        </w:numPr>
+        <w:spacing w:after="20" w:line="240" w:lineRule="auto"/>
       </w:pPr>
       <w:r>
         <w:rPr>
@@ -1112,12 +1119,12 @@
     </w:p>
     <w:p>
       <w:pPr>
-        <w:pStyle w:val="ListParagraph"/>
-        <w:numPr>
-          <w:ilvl w:val="0"/>
-          <w:numId w:val="2"/>
-        </w:numPr>
-        <w:spacing w:after="40" w:line="264" w:lineRule="auto"/>
+        <w:pStyle w:val="Normal"/>
+        <w:numPr>
+          <w:ilvl w:val="0"/>
+          <w:numId w:val="2"/>
+        </w:numPr>
+        <w:spacing w:after="20" w:line="240" w:lineRule="auto"/>
       </w:pPr>
       <w:r>
         <w:rPr>
@@ -1130,12 +1137,12 @@
     </w:p>
     <w:p>
       <w:pPr>
-        <w:pStyle w:val="ListParagraph"/>
-        <w:numPr>
-          <w:ilvl w:val="0"/>
-          <w:numId w:val="2"/>
-        </w:numPr>
-        <w:spacing w:after="40" w:line="264" w:lineRule="auto"/>
+        <w:pStyle w:val="Normal"/>
+        <w:numPr>
+          <w:ilvl w:val="0"/>
+          <w:numId w:val="2"/>
+        </w:numPr>
+        <w:spacing w:after="20" w:line="240" w:lineRule="auto"/>
       </w:pPr>
       <w:r>
         <w:rPr>
@@ -1148,7 +1155,8 @@
     </w:p>
     <w:p>
       <w:pPr>
-        <w:spacing w:after="20" w:before="140" w:line="264" w:lineRule="auto"/>
+        <w:pStyle w:val="Normal"/>
+        <w:spacing w:after="20" w:before="140" w:line="240" w:lineRule="auto"/>
       </w:pPr>
       <w:r>
         <w:rPr>
@@ -1193,12 +1201,12 @@
     </w:p>
     <w:p>
       <w:pPr>
-        <w:pStyle w:val="ListParagraph"/>
-        <w:numPr>
-          <w:ilvl w:val="0"/>
-          <w:numId w:val="2"/>
-        </w:numPr>
-        <w:spacing w:after="40" w:line="264" w:lineRule="auto"/>
+        <w:pStyle w:val="Normal"/>
+        <w:numPr>
+          <w:ilvl w:val="0"/>
+          <w:numId w:val="2"/>
+        </w:numPr>
+        <w:spacing w:after="20" w:line="240" w:lineRule="auto"/>
       </w:pPr>
       <w:r>
         <w:rPr>
@@ -1211,12 +1219,12 @@
     </w:p>
     <w:p>
       <w:pPr>
-        <w:pStyle w:val="ListParagraph"/>
-        <w:numPr>
-          <w:ilvl w:val="0"/>
-          <w:numId w:val="2"/>
-        </w:numPr>
-        <w:spacing w:after="40" w:line="264" w:lineRule="auto"/>
+        <w:pStyle w:val="Normal"/>
+        <w:numPr>
+          <w:ilvl w:val="0"/>
+          <w:numId w:val="2"/>
+        </w:numPr>
+        <w:spacing w:after="20" w:line="240" w:lineRule="auto"/>
       </w:pPr>
       <w:r>
         <w:rPr>
@@ -1229,12 +1237,12 @@
     </w:p>
     <w:p>
       <w:pPr>
-        <w:pStyle w:val="ListParagraph"/>
-        <w:numPr>
-          <w:ilvl w:val="0"/>
-          <w:numId w:val="2"/>
-        </w:numPr>
-        <w:spacing w:after="40" w:line="264" w:lineRule="auto"/>
+        <w:pStyle w:val="Normal"/>
+        <w:numPr>
+          <w:ilvl w:val="0"/>
+          <w:numId w:val="2"/>
+        </w:numPr>
+        <w:spacing w:after="20" w:line="240" w:lineRule="auto"/>
       </w:pPr>
       <w:r>
         <w:rPr>
@@ -1247,10 +1255,8 @@
     </w:p>
     <w:p>
       <w:pPr>
-        <w:pBdr>
-          <w:bottom w:val="single" w:color="1F4E79" w:sz="4" w:space="0"/>
-        </w:pBdr>
-        <w:spacing w:after="60" w:before="160" w:line="264" w:lineRule="auto"/>
+        <w:pStyle w:val="SectionHeading"/>
+        <w:spacing w:after="50" w:before="120" w:line="240" w:lineRule="auto"/>
       </w:pPr>
       <w:r>
         <w:rPr>
@@ -1266,9 +1272,10 @@
     </w:p>
     <w:p>
       <w:pPr>
-        <w:spacing w:after="20" w:before="120" w:line="264" w:lineRule="auto"/>
-      </w:pPr>
-      <w:hyperlink w:history="1" r:id="rIdfllcazfe3k0us3hiun99q">
+        <w:pStyle w:val="Normal"/>
+        <w:spacing w:after="20" w:before="120" w:line="240" w:lineRule="auto"/>
+      </w:pPr>
+      <w:hyperlink w:history="1" r:id="rIdrwai8m1csvtw_tuwx4pcm">
         <w:r>
           <w:rPr>
             <w:rFonts w:ascii="Arial" w:cs="Arial" w:eastAsia="Arial" w:hAnsi="Arial"/>
@@ -1301,7 +1308,7 @@
         </w:rPr>
         <w:t xml:space="preserve">  |  </w:t>
       </w:r>
-      <w:hyperlink w:history="1" r:id="rIdefeozkt9u7tc3daq60l-n">
+      <w:hyperlink w:history="1" r:id="rIdpommnfxfv_fufnxqbxgdm">
         <w:r>
           <w:rPr>
             <w:rFonts w:ascii="Arial" w:cs="Arial" w:eastAsia="Arial" w:hAnsi="Arial"/>
@@ -1315,7 +1322,8 @@
     </w:p>
     <w:p>
       <w:pPr>
-        <w:spacing w:after="80" w:before="20" w:line="264" w:lineRule="auto"/>
+        <w:pStyle w:val="Normal"/>
+        <w:spacing w:after="50" w:before="20" w:line="240" w:lineRule="auto"/>
       </w:pPr>
       <w:r>
         <w:rPr>
@@ -1328,9 +1336,10 @@
     </w:p>
     <w:p>
       <w:pPr>
-        <w:spacing w:after="20" w:before="120" w:line="264" w:lineRule="auto"/>
-      </w:pPr>
-      <w:hyperlink w:history="1" r:id="rIdmdnucsxktz21w4xmepbnx">
+        <w:pStyle w:val="Normal"/>
+        <w:spacing w:after="20" w:before="120" w:line="240" w:lineRule="auto"/>
+      </w:pPr>
+      <w:hyperlink w:history="1" r:id="rIdijw5_zt_sb_whmq8_982k">
         <w:r>
           <w:rPr>
             <w:rFonts w:ascii="Arial" w:cs="Arial" w:eastAsia="Arial" w:hAnsi="Arial"/>
@@ -1363,7 +1372,7 @@
         </w:rPr>
         <w:t xml:space="preserve">  |  </w:t>
       </w:r>
-      <w:hyperlink w:history="1" r:id="rIdilz2fermn859taijwyqsd">
+      <w:hyperlink w:history="1" r:id="rId1nqabnjekatwzrxhf5x9c">
         <w:r>
           <w:rPr>
             <w:rFonts w:ascii="Arial" w:cs="Arial" w:eastAsia="Arial" w:hAnsi="Arial"/>
@@ -1377,7 +1386,8 @@
     </w:p>
     <w:p>
       <w:pPr>
-        <w:spacing w:after="80" w:before="20" w:line="264" w:lineRule="auto"/>
+        <w:pStyle w:val="Normal"/>
+        <w:spacing w:after="50" w:before="20" w:line="240" w:lineRule="auto"/>
       </w:pPr>
       <w:r>
         <w:rPr>
@@ -1390,9 +1400,10 @@
     </w:p>
     <w:p>
       <w:pPr>
-        <w:spacing w:after="20" w:before="120" w:line="264" w:lineRule="auto"/>
-      </w:pPr>
-      <w:hyperlink w:history="1" r:id="rId37qmizmf1wcea05suddcw">
+        <w:pStyle w:val="Normal"/>
+        <w:spacing w:after="20" w:before="120" w:line="240" w:lineRule="auto"/>
+      </w:pPr>
+      <w:hyperlink w:history="1" r:id="rIdfcntd2tfrux8ahrzyssko">
         <w:r>
           <w:rPr>
             <w:rFonts w:ascii="Arial" w:cs="Arial" w:eastAsia="Arial" w:hAnsi="Arial"/>
@@ -1425,7 +1436,7 @@
         </w:rPr>
         <w:t xml:space="preserve">  |  </w:t>
       </w:r>
-      <w:hyperlink w:history="1" r:id="rIdckxitkvxt7rgs01pnfrot">
+      <w:hyperlink w:history="1" r:id="rId7uycevuignwihoqkig15-">
         <w:r>
           <w:rPr>
             <w:rFonts w:ascii="Arial" w:cs="Arial" w:eastAsia="Arial" w:hAnsi="Arial"/>
@@ -1439,7 +1450,8 @@
     </w:p>
     <w:p>
       <w:pPr>
-        <w:spacing w:after="80" w:before="20" w:line="264" w:lineRule="auto"/>
+        <w:pStyle w:val="Normal"/>
+        <w:spacing w:after="50" w:before="20" w:line="240" w:lineRule="auto"/>
       </w:pPr>
       <w:r>
         <w:rPr>
@@ -1449,7 +1461,7 @@
         </w:rPr>
         <w:t xml:space="preserve">Designed, illustrated, and built a mobile game in React Native, shipping one codebase to iOS and Android as real native UI. Published on the </w:t>
       </w:r>
-      <w:hyperlink w:history="1" r:id="rIduzst7k3eagfk_-xoyio5l">
+      <w:hyperlink w:history="1" r:id="rIdnjh_jzzysdio0pxnsmze3">
         <w:r>
           <w:rPr>
             <w:rFonts w:ascii="Arial" w:cs="Arial" w:eastAsia="Arial" w:hAnsi="Arial"/>
@@ -1471,10 +1483,8 @@
     </w:p>
     <w:p>
       <w:pPr>
-        <w:pBdr>
-          <w:bottom w:val="single" w:color="1F4E79" w:sz="4" w:space="0"/>
-        </w:pBdr>
-        <w:spacing w:after="60" w:before="160" w:line="264" w:lineRule="auto"/>
+        <w:pStyle w:val="SectionHeading"/>
+        <w:spacing w:after="50" w:before="120" w:line="240" w:lineRule="auto"/>
       </w:pPr>
       <w:r>
         <w:rPr>
@@ -1490,7 +1500,8 @@
     </w:p>
     <w:p>
       <w:pPr>
-        <w:spacing w:after="40" w:before="20" w:line="264" w:lineRule="auto"/>
+        <w:pStyle w:val="Normal"/>
+        <w:spacing w:after="40" w:before="20" w:line="240" w:lineRule="auto"/>
       </w:pPr>
       <w:r>
         <w:rPr>
@@ -1513,7 +1524,8 @@
     </w:p>
     <w:p>
       <w:pPr>
-        <w:spacing w:after="40" w:before="20" w:line="264" w:lineRule="auto"/>
+        <w:pStyle w:val="Normal"/>
+        <w:spacing w:after="40" w:before="20" w:line="240" w:lineRule="auto"/>
       </w:pPr>
       <w:r>
         <w:rPr>
@@ -1536,10 +1548,8 @@
     </w:p>
     <w:p>
       <w:pPr>
-        <w:pBdr>
-          <w:bottom w:val="single" w:color="1F4E79" w:sz="4" w:space="0"/>
-        </w:pBdr>
-        <w:spacing w:after="60" w:before="160" w:line="264" w:lineRule="auto"/>
+        <w:pStyle w:val="SectionHeading"/>
+        <w:spacing w:after="50" w:before="120" w:line="240" w:lineRule="auto"/>
       </w:pPr>
       <w:r>
         <w:rPr>
@@ -1555,7 +1565,8 @@
     </w:p>
     <w:p>
       <w:pPr>
-        <w:spacing w:after="80" w:before="20" w:line="264" w:lineRule="auto"/>
+        <w:pStyle w:val="Normal"/>
+        <w:spacing w:after="50" w:before="20" w:line="240" w:lineRule="auto"/>
       </w:pPr>
       <w:r>
         <w:rPr>
@@ -1568,10 +1579,8 @@
     </w:p>
     <w:p>
       <w:pPr>
-        <w:pBdr>
-          <w:bottom w:val="single" w:color="1F4E79" w:sz="4" w:space="0"/>
-        </w:pBdr>
-        <w:spacing w:after="60" w:before="160" w:line="264" w:lineRule="auto"/>
+        <w:pStyle w:val="SectionHeading"/>
+        <w:spacing w:after="50" w:before="120" w:line="240" w:lineRule="auto"/>
       </w:pPr>
       <w:r>
         <w:rPr>
@@ -1587,9 +1596,10 @@
     </w:p>
     <w:p>
       <w:pPr>
-        <w:spacing w:after="20" w:before="120" w:line="264" w:lineRule="auto"/>
-      </w:pPr>
-      <w:hyperlink w:history="1" r:id="rIdmwsv6rn2jgvl40iqnrr4h">
+        <w:pStyle w:val="Normal"/>
+        <w:spacing w:after="20" w:before="120" w:line="240" w:lineRule="auto"/>
+      </w:pPr>
+      <w:hyperlink w:history="1" r:id="rIdu_benlpllovbktlu-hr_6">
         <w:r>
           <w:rPr>
             <w:rFonts w:ascii="Arial" w:cs="Arial" w:eastAsia="Arial" w:hAnsi="Arial"/>
@@ -1622,7 +1632,7 @@
         </w:rPr>
         <w:t xml:space="preserve">  |  </w:t>
       </w:r>
-      <w:hyperlink w:history="1" r:id="rId59b7hsy9iavxcjl8zj75n">
+      <w:hyperlink w:history="1" r:id="rIdt3-_ntrvmwnmhup4b0l1k">
         <w:r>
           <w:rPr>
             <w:rFonts w:ascii="Arial" w:cs="Arial" w:eastAsia="Arial" w:hAnsi="Arial"/>
@@ -1636,7 +1646,8 @@
     </w:p>
     <w:p>
       <w:pPr>
-        <w:spacing w:after="80" w:before="20" w:line="264" w:lineRule="auto"/>
+        <w:pStyle w:val="Normal"/>
+        <w:spacing w:after="50" w:before="20" w:line="240" w:lineRule="auto"/>
       </w:pPr>
       <w:r>
         <w:rPr>
@@ -2025,5 +2036,32 @@
       <w:szCs w:val="20"/>
     </w:rPr>
   </w:style>
+  <w:style w:type="paragraph" w:styleId="Normal">
+    <w:name w:val="Normal"/>
+    <w:rPr>
+      <w:rFonts w:ascii="Arial" w:cs="Arial" w:eastAsia="Arial" w:hAnsi="Arial"/>
+      <w:sz w:val="19"/>
+      <w:szCs w:val="19"/>
+    </w:rPr>
+  </w:style>
+  <w:style w:type="paragraph" w:styleId="SectionHeading">
+    <w:name w:val="Section Heading"/>
+    <w:basedOn w:val="Normal"/>
+    <w:next w:val="Normal"/>
+    <w:qFormat/>
+    <w:pPr>
+      <w:pBdr>
+        <w:bottom w:val="single" w:color="1F4E79" w:sz="4" w:space="0"/>
+      </w:pBdr>
+    </w:pPr>
+    <w:rPr>
+      <w:rFonts w:ascii="Arial" w:cs="Arial" w:eastAsia="Arial" w:hAnsi="Arial"/>
+      <w:b/>
+      <w:bCs/>
+      <w:color w:val="1F4E79"/>
+      <w:sz w:val="22"/>
+      <w:szCs w:val="22"/>
+    </w:rPr>
+  </w:style>
 </w:styles>
 </file>
</xml_diff>

<commit_message>
Tighten resume wording from external review
Combine the two Salesforce process bullets, soften the org-wide
TypeScript claim to 'helped drive', lead the pseudo-localization bullet
with its value, replace 'top-priority value driver', order frontend
languages first, and compact Food Cards and Beyond Engineering.

Co-Authored-By: Claude Opus 5 <noreply@anthropic.com>
</commit_message>
<xml_diff>
--- a/public/travis-hoki-resume.docx
+++ b/public/travis-hoki-resume.docx
@@ -58,7 +58,7 @@
         </w:rPr>
         <w:t xml:space="preserve">  |  </w:t>
       </w:r>
-      <w:hyperlink w:history="1" r:id="rIdixhzddrd9om-b9rsgfh4z">
+      <w:hyperlink w:history="1" r:id="rIdaljhmyt4z0hom-a1noeas">
         <w:r>
           <w:rPr>
             <w:rFonts w:ascii="Arial" w:cs="Arial" w:eastAsia="Arial" w:hAnsi="Arial"/>
@@ -77,7 +77,7 @@
         </w:rPr>
         <w:t xml:space="preserve">  |  </w:t>
       </w:r>
-      <w:hyperlink w:history="1" r:id="rIdwgjfthvnpjoshcyw9_ckj">
+      <w:hyperlink w:history="1" r:id="rIdbhrqql1hpycwdw7ku_hif">
         <w:r>
           <w:rPr>
             <w:rFonts w:ascii="Arial" w:cs="Arial" w:eastAsia="Arial" w:hAnsi="Arial"/>
@@ -95,7 +95,7 @@
         <w:spacing w:after="160" w:line="240" w:lineRule="auto"/>
         <w:jc w:val="center"/>
       </w:pPr>
-      <w:hyperlink w:history="1" r:id="rIdewrxay7hbjmw3wpqn3k2c">
+      <w:hyperlink w:history="1" r:id="rIdlgajifzfky4npwsaekfzn">
         <w:r>
           <w:rPr>
             <w:rFonts w:ascii="Arial" w:cs="Arial" w:eastAsia="Arial" w:hAnsi="Arial"/>
@@ -114,7 +114,7 @@
         </w:rPr>
         <w:t xml:space="preserve">  |  </w:t>
       </w:r>
-      <w:hyperlink w:history="1" r:id="rIdzrkliftsbw8x5hok_hofu">
+      <w:hyperlink w:history="1" r:id="rIduy40p89yqm7dd6jvjft2a">
         <w:r>
           <w:rPr>
             <w:rFonts w:ascii="Arial" w:cs="Arial" w:eastAsia="Arial" w:hAnsi="Arial"/>
@@ -133,7 +133,7 @@
         </w:rPr>
         <w:t xml:space="preserve">  |  </w:t>
       </w:r>
-      <w:hyperlink w:history="1" r:id="rIdes8nnatzfkb5mbcgcdf5n">
+      <w:hyperlink w:history="1" r:id="rIdtxm39ap-v4y3gjkjd9oe1">
         <w:r>
           <w:rPr>
             <w:rFonts w:ascii="Arial" w:cs="Arial" w:eastAsia="Arial" w:hAnsi="Arial"/>
@@ -173,7 +173,7 @@
           <w:sz w:val="19"/>
           <w:szCs w:val="19"/>
         </w:rPr>
-        <w:t xml:space="preserve">Senior Software Engineer with 14+ years building and evolving web applications. Frontend specialist in React, TypeScript, and JavaScript, with working experience across backend services and React Native mobile. My work spans internal developer tooling and customer-facing product, from platform systems that took products into new markets to shopping features on a major retail site. Joined Spiff as an early frontend engineer and stayed through its acquisition by Salesforce.</w:t>
+        <w:t xml:space="preserve">Senior Software Engineer with 14+ years of experience building, scaling, and modernizing web applications. Frontend specialist in React, TypeScript, and JavaScript, with working experience across backend services and React Native mobile. My work spans internal developer tooling and customer-facing product, from platform systems that took products into new markets to shopping features on a major retail site. Joined Spiff as an early frontend engineer and stayed through its acquisition by Salesforce.</w:t>
       </w:r>
     </w:p>
     <w:p>
@@ -218,7 +218,7 @@
           <w:sz w:val="19"/>
           <w:szCs w:val="19"/>
         </w:rPr>
-        <w:t xml:space="preserve">Claude Code, Cursor AI, AI pair programming in production codebases</w:t>
+        <w:t xml:space="preserve">Claude Code, Cursor AI, AI-assisted production development</w:t>
       </w:r>
     </w:p>
     <w:p>
@@ -246,7 +246,7 @@
           <w:sz w:val="19"/>
           <w:szCs w:val="19"/>
         </w:rPr>
-        <w:t xml:space="preserve">TypeScript, JavaScript (ES6+), PHP, Python, Ruby, SQL, HTML5, CSS3, Sass/SCSS, Less</w:t>
+        <w:t xml:space="preserve">TypeScript, JavaScript (ES6+), HTML5, CSS3, Sass/SCSS, Less, PHP, Python, SQL, Ruby</w:t>
       </w:r>
     </w:p>
     <w:p>
@@ -302,7 +302,7 @@
           <w:sz w:val="19"/>
           <w:szCs w:val="19"/>
         </w:rPr>
-        <w:t xml:space="preserve">Node.js, Express, Django, PostgreSQL, MySQL, Firebase/Firestore, GraphQL, RESTful API design and integration, Stripe</w:t>
+        <w:t xml:space="preserve">Node.js, Express, Django, PostgreSQL, MySQL, Firebase/Firestore, GraphQL, REST APIs and API integration, Stripe</w:t>
       </w:r>
     </w:p>
     <w:p>
@@ -456,7 +456,7 @@
           <w:sz w:val="19"/>
           <w:szCs w:val="19"/>
         </w:rPr>
-        <w:t xml:space="preserve">Raised the codebase to Salesforce’s post-acquisition unit-test coverage standard, expanding Jest test suites across the frontend. Established strict ESLint rule sets that drove company-wide TypeScript adoption.</w:t>
+        <w:t xml:space="preserve">Raised the frontend codebase to Salesforce’s post-acquisition quality standards, expanding Jest coverage and establishing strict ESLint rule sets. That work helped drive TypeScript adoption across the engineering organization.</w:t>
       </w:r>
     </w:p>
     <w:p>
@@ -584,25 +584,25 @@
           <w:sz w:val="19"/>
           <w:szCs w:val="19"/>
         </w:rPr>
-        <w:t xml:space="preserve">Architected the frontend internationalization infrastructure from the ground up and migrated thousands of hardcoded strings across the application. Launched the product in Japanese, Spanish, and additional locales, a top-priority value driver for Spiff and Salesforce.</w:t>
-      </w:r>
-    </w:p>
-    <w:p>
-      <w:pPr>
-        <w:pStyle w:val="Normal"/>
-        <w:numPr>
-          <w:ilvl w:val="0"/>
-          <w:numId w:val="2"/>
-        </w:numPr>
-        <w:spacing w:after="20" w:line="240" w:lineRule="auto"/>
-      </w:pPr>
-      <w:r>
-        <w:rPr>
-          <w:rFonts w:ascii="Arial" w:cs="Arial" w:eastAsia="Arial" w:hAnsi="Arial"/>
-          <w:sz w:val="19"/>
-          <w:szCs w:val="19"/>
-        </w:rPr>
-        <w:t xml:space="preserve">Created a dev-mode pseudo-localization toggle that renders every translated string as X’s. It became the team’s standard pre-merge check, letting any engineer spot untranslated UI in seconds.</w:t>
+        <w:t xml:space="preserve">Architected the frontend internationalization infrastructure from the ground up and migrated thousands of hardcoded strings across the application. Launched the product in Japanese, Spanish, and additional locales, supporting a major expansion priority for Spiff and Salesforce.</w:t>
+      </w:r>
+    </w:p>
+    <w:p>
+      <w:pPr>
+        <w:pStyle w:val="Normal"/>
+        <w:numPr>
+          <w:ilvl w:val="0"/>
+          <w:numId w:val="2"/>
+        </w:numPr>
+        <w:spacing w:after="20" w:line="240" w:lineRule="auto"/>
+      </w:pPr>
+      <w:r>
+        <w:rPr>
+          <w:rFonts w:ascii="Arial" w:cs="Arial" w:eastAsia="Arial" w:hAnsi="Arial"/>
+          <w:sz w:val="19"/>
+          <w:szCs w:val="19"/>
+        </w:rPr>
+        <w:t xml:space="preserve">Created a pseudo-localization tool that became the team’s standard pre-merge check for untranslated UI. It renders every translated string as X’s, letting any engineer spot gaps in seconds.</w:t>
       </w:r>
     </w:p>
     <w:p>
@@ -767,7 +767,7 @@
           <w:sz w:val="19"/>
           <w:szCs w:val="19"/>
         </w:rPr>
-        <w:t xml:space="preserve">Modernized legacy core technologies and syntax paradigms, improving runtime performance and reducing maintenance burden.</w:t>
+        <w:t xml:space="preserve">Modernized legacy frontend architecture and JavaScript patterns, improving runtime performance and reducing ongoing maintenance burden.</w:t>
       </w:r>
     </w:p>
     <w:p>
@@ -1275,7 +1275,7 @@
         <w:pStyle w:val="Normal"/>
         <w:spacing w:after="20" w:before="120" w:line="240" w:lineRule="auto"/>
       </w:pPr>
-      <w:hyperlink w:history="1" r:id="rIdrwai8m1csvtw_tuwx4pcm">
+      <w:hyperlink w:history="1" r:id="rIdrkbi6xiu3qgizqglettvv">
         <w:r>
           <w:rPr>
             <w:rFonts w:ascii="Arial" w:cs="Arial" w:eastAsia="Arial" w:hAnsi="Arial"/>
@@ -1308,7 +1308,7 @@
         </w:rPr>
         <w:t xml:space="preserve">  |  </w:t>
       </w:r>
-      <w:hyperlink w:history="1" r:id="rIdpommnfxfv_fufnxqbxgdm">
+      <w:hyperlink w:history="1" r:id="rIdxyp-9thdovvurqjkwt1wg">
         <w:r>
           <w:rPr>
             <w:rFonts w:ascii="Arial" w:cs="Arial" w:eastAsia="Arial" w:hAnsi="Arial"/>
@@ -1331,7 +1331,7 @@
           <w:sz w:val="19"/>
           <w:szCs w:val="19"/>
         </w:rPr>
-        <w:t xml:space="preserve">A safe-foods catalog built for my son, who has food avoidance issues. Integrated Claude via the Anthropic SDK (@anthropic-ai/sdk) so users filter the collection in plain English. “Easy breakfast ideas” resolves to category, difficulty, sort order, and keyword filters at once. Prompt engineering enforces strict JSON output, and every response is schema-validated before use. Ambiguous output degrades gracefully rather than breaking the UI. Also implemented scored fuzzy search.</w:t>
+        <w:t xml:space="preserve">A safe-foods catalog built for my son, who has food avoidance issues. Integrated Claude via the Anthropic SDK (@anthropic-ai/sdk) so users filter the collection in plain English. “Easy breakfast ideas” resolves to category, difficulty, sort order, and keyword filters at once. Prompt engineering enforces schema-validated JSON, so ambiguous output degrades gracefully rather than breaking the UI. Also implemented scored fuzzy search.</w:t>
       </w:r>
     </w:p>
     <w:p>
@@ -1339,7 +1339,7 @@
         <w:pStyle w:val="Normal"/>
         <w:spacing w:after="20" w:before="120" w:line="240" w:lineRule="auto"/>
       </w:pPr>
-      <w:hyperlink w:history="1" r:id="rIdijw5_zt_sb_whmq8_982k">
+      <w:hyperlink w:history="1" r:id="rIdavhrs39bd29qhiirkj0io">
         <w:r>
           <w:rPr>
             <w:rFonts w:ascii="Arial" w:cs="Arial" w:eastAsia="Arial" w:hAnsi="Arial"/>
@@ -1372,7 +1372,7 @@
         </w:rPr>
         <w:t xml:space="preserve">  |  </w:t>
       </w:r>
-      <w:hyperlink w:history="1" r:id="rId1nqabnjekatwzrxhf5x9c">
+      <w:hyperlink w:history="1" r:id="rIdomk6gj_vic2qbjabcbujh">
         <w:r>
           <w:rPr>
             <w:rFonts w:ascii="Arial" w:cs="Arial" w:eastAsia="Arial" w:hAnsi="Arial"/>
@@ -1403,7 +1403,7 @@
         <w:pStyle w:val="Normal"/>
         <w:spacing w:after="20" w:before="120" w:line="240" w:lineRule="auto"/>
       </w:pPr>
-      <w:hyperlink w:history="1" r:id="rIdfcntd2tfrux8ahrzyssko">
+      <w:hyperlink w:history="1" r:id="rIdjxcoqpu_edcnyxoqd1exz">
         <w:r>
           <w:rPr>
             <w:rFonts w:ascii="Arial" w:cs="Arial" w:eastAsia="Arial" w:hAnsi="Arial"/>
@@ -1436,7 +1436,7 @@
         </w:rPr>
         <w:t xml:space="preserve">  |  </w:t>
       </w:r>
-      <w:hyperlink w:history="1" r:id="rId7uycevuignwihoqkig15-">
+      <w:hyperlink w:history="1" r:id="rIdhl-avps6jq-7s5dlgicid">
         <w:r>
           <w:rPr>
             <w:rFonts w:ascii="Arial" w:cs="Arial" w:eastAsia="Arial" w:hAnsi="Arial"/>
@@ -1461,7 +1461,7 @@
         </w:rPr>
         <w:t xml:space="preserve">Designed, illustrated, and built a mobile game in React Native, shipping one codebase to iOS and Android as real native UI. Published on the </w:t>
       </w:r>
-      <w:hyperlink w:history="1" r:id="rIdnjh_jzzysdio0pxnsmze3">
+      <w:hyperlink w:history="1" r:id="rIdizsphypxm5gua98vlultu">
         <w:r>
           <w:rPr>
             <w:rFonts w:ascii="Arial" w:cs="Arial" w:eastAsia="Arial" w:hAnsi="Arial"/>
@@ -1574,7 +1574,7 @@
           <w:sz w:val="19"/>
           <w:szCs w:val="19"/>
         </w:rPr>
-        <w:t xml:space="preserve">Illustrated and self-published two children’s books, one Kickstarter-funded. Improv Broadway stand-up comedy graduate. Volunteer Cub Scouts den leader.</w:t>
+        <w:t xml:space="preserve">Illustrator and self-published author of two children’s books, one Kickstarter-funded. Improv Broadway stand-up comedy graduate and volunteer Cub Scouts den leader.</w:t>
       </w:r>
     </w:p>
     <w:p>
@@ -1599,7 +1599,7 @@
         <w:pStyle w:val="Normal"/>
         <w:spacing w:after="20" w:before="120" w:line="240" w:lineRule="auto"/>
       </w:pPr>
-      <w:hyperlink w:history="1" r:id="rIdu_benlpllovbktlu-hr_6">
+      <w:hyperlink w:history="1" r:id="rIdtrigg2_xptitzjm3fasog">
         <w:r>
           <w:rPr>
             <w:rFonts w:ascii="Arial" w:cs="Arial" w:eastAsia="Arial" w:hAnsi="Arial"/>
@@ -1632,7 +1632,7 @@
         </w:rPr>
         <w:t xml:space="preserve">  |  </w:t>
       </w:r>
-      <w:hyperlink w:history="1" r:id="rIdt3-_ntrvmwnmhup4b0l1k">
+      <w:hyperlink w:history="1" r:id="rIdkvgkffqv2kpdszejz25sk">
         <w:r>
           <w:rPr>
             <w:rFonts w:ascii="Arial" w:cs="Arial" w:eastAsia="Arial" w:hAnsi="Arial"/>

</xml_diff>

<commit_message>
Restore company-wide TypeScript claim; rename section to Personal Projects
TypeScript adoption was confirmed org-wide, so the softened wording is
no longer warranted. 'Passion Projects' risked reading as hobbyist for
work that includes a shipped App Store product and a real business.

Co-Authored-By: Claude Opus 5 <noreply@anthropic.com>
</commit_message>
<xml_diff>
--- a/public/travis-hoki-resume.docx
+++ b/public/travis-hoki-resume.docx
@@ -58,7 +58,7 @@
         </w:rPr>
         <w:t xml:space="preserve">  |  </w:t>
       </w:r>
-      <w:hyperlink w:history="1" r:id="rIdaljhmyt4z0hom-a1noeas">
+      <w:hyperlink w:history="1" r:id="rIdhl4d4ektkmbhsaqaawkci">
         <w:r>
           <w:rPr>
             <w:rFonts w:ascii="Arial" w:cs="Arial" w:eastAsia="Arial" w:hAnsi="Arial"/>
@@ -77,7 +77,7 @@
         </w:rPr>
         <w:t xml:space="preserve">  |  </w:t>
       </w:r>
-      <w:hyperlink w:history="1" r:id="rIdbhrqql1hpycwdw7ku_hif">
+      <w:hyperlink w:history="1" r:id="rId4llxzfiim4ehwyflzxdcs">
         <w:r>
           <w:rPr>
             <w:rFonts w:ascii="Arial" w:cs="Arial" w:eastAsia="Arial" w:hAnsi="Arial"/>
@@ -95,7 +95,7 @@
         <w:spacing w:after="160" w:line="240" w:lineRule="auto"/>
         <w:jc w:val="center"/>
       </w:pPr>
-      <w:hyperlink w:history="1" r:id="rIdlgajifzfky4npwsaekfzn">
+      <w:hyperlink w:history="1" r:id="rIdml03dtbfqfjj05uk5ryzb">
         <w:r>
           <w:rPr>
             <w:rFonts w:ascii="Arial" w:cs="Arial" w:eastAsia="Arial" w:hAnsi="Arial"/>
@@ -114,7 +114,7 @@
         </w:rPr>
         <w:t xml:space="preserve">  |  </w:t>
       </w:r>
-      <w:hyperlink w:history="1" r:id="rIduy40p89yqm7dd6jvjft2a">
+      <w:hyperlink w:history="1" r:id="rIdfrlgdmll9vzidg1ok4geo">
         <w:r>
           <w:rPr>
             <w:rFonts w:ascii="Arial" w:cs="Arial" w:eastAsia="Arial" w:hAnsi="Arial"/>
@@ -133,7 +133,7 @@
         </w:rPr>
         <w:t xml:space="preserve">  |  </w:t>
       </w:r>
-      <w:hyperlink w:history="1" r:id="rIdtxm39ap-v4y3gjkjd9oe1">
+      <w:hyperlink w:history="1" r:id="rId8y2urlk1w4wf9bb6n4faz">
         <w:r>
           <w:rPr>
             <w:rFonts w:ascii="Arial" w:cs="Arial" w:eastAsia="Arial" w:hAnsi="Arial"/>
@@ -456,7 +456,7 @@
           <w:sz w:val="19"/>
           <w:szCs w:val="19"/>
         </w:rPr>
-        <w:t xml:space="preserve">Raised the frontend codebase to Salesforce’s post-acquisition quality standards, expanding Jest coverage and establishing strict ESLint rule sets. That work helped drive TypeScript adoption across the engineering organization.</w:t>
+        <w:t xml:space="preserve">Raised the frontend codebase to Salesforce’s post-acquisition quality standards, expanding Jest coverage and establishing strict ESLint rule sets. That work drove company-wide TypeScript adoption.</w:t>
       </w:r>
     </w:p>
     <w:p>
@@ -1267,7 +1267,7 @@
           <w:sz w:val="22"/>
           <w:szCs w:val="22"/>
         </w:rPr>
-        <w:t xml:space="preserve">PASSION PROJECTS</w:t>
+        <w:t xml:space="preserve">PERSONAL PROJECTS</w:t>
       </w:r>
     </w:p>
     <w:p>
@@ -1275,7 +1275,7 @@
         <w:pStyle w:val="Normal"/>
         <w:spacing w:after="20" w:before="120" w:line="240" w:lineRule="auto"/>
       </w:pPr>
-      <w:hyperlink w:history="1" r:id="rIdrkbi6xiu3qgizqglettvv">
+      <w:hyperlink w:history="1" r:id="rIdcdvnhzes0rve014b0krsh">
         <w:r>
           <w:rPr>
             <w:rFonts w:ascii="Arial" w:cs="Arial" w:eastAsia="Arial" w:hAnsi="Arial"/>
@@ -1308,7 +1308,7 @@
         </w:rPr>
         <w:t xml:space="preserve">  |  </w:t>
       </w:r>
-      <w:hyperlink w:history="1" r:id="rIdxyp-9thdovvurqjkwt1wg">
+      <w:hyperlink w:history="1" r:id="rIdhpoemmvexcdzoxqe--xvv">
         <w:r>
           <w:rPr>
             <w:rFonts w:ascii="Arial" w:cs="Arial" w:eastAsia="Arial" w:hAnsi="Arial"/>
@@ -1339,7 +1339,7 @@
         <w:pStyle w:val="Normal"/>
         <w:spacing w:after="20" w:before="120" w:line="240" w:lineRule="auto"/>
       </w:pPr>
-      <w:hyperlink w:history="1" r:id="rIdavhrs39bd29qhiirkj0io">
+      <w:hyperlink w:history="1" r:id="rIdc_tdnhev4nhdo8sgpx-ru">
         <w:r>
           <w:rPr>
             <w:rFonts w:ascii="Arial" w:cs="Arial" w:eastAsia="Arial" w:hAnsi="Arial"/>
@@ -1372,7 +1372,7 @@
         </w:rPr>
         <w:t xml:space="preserve">  |  </w:t>
       </w:r>
-      <w:hyperlink w:history="1" r:id="rIdomk6gj_vic2qbjabcbujh">
+      <w:hyperlink w:history="1" r:id="rIdfpr072rtj-hu5j3ifkwze">
         <w:r>
           <w:rPr>
             <w:rFonts w:ascii="Arial" w:cs="Arial" w:eastAsia="Arial" w:hAnsi="Arial"/>
@@ -1403,7 +1403,7 @@
         <w:pStyle w:val="Normal"/>
         <w:spacing w:after="20" w:before="120" w:line="240" w:lineRule="auto"/>
       </w:pPr>
-      <w:hyperlink w:history="1" r:id="rIdjxcoqpu_edcnyxoqd1exz">
+      <w:hyperlink w:history="1" r:id="rIdtucv911qo0q4sxdqvp5ur">
         <w:r>
           <w:rPr>
             <w:rFonts w:ascii="Arial" w:cs="Arial" w:eastAsia="Arial" w:hAnsi="Arial"/>
@@ -1436,7 +1436,7 @@
         </w:rPr>
         <w:t xml:space="preserve">  |  </w:t>
       </w:r>
-      <w:hyperlink w:history="1" r:id="rIdhl-avps6jq-7s5dlgicid">
+      <w:hyperlink w:history="1" r:id="rId4s0byup33irgacjkoucj9">
         <w:r>
           <w:rPr>
             <w:rFonts w:ascii="Arial" w:cs="Arial" w:eastAsia="Arial" w:hAnsi="Arial"/>
@@ -1461,7 +1461,7 @@
         </w:rPr>
         <w:t xml:space="preserve">Designed, illustrated, and built a mobile game in React Native, shipping one codebase to iOS and Android as real native UI. Published on the </w:t>
       </w:r>
-      <w:hyperlink w:history="1" r:id="rIdizsphypxm5gua98vlultu">
+      <w:hyperlink w:history="1" r:id="rIdch873whvyyezpfugpi9ox">
         <w:r>
           <w:rPr>
             <w:rFonts w:ascii="Arial" w:cs="Arial" w:eastAsia="Arial" w:hAnsi="Arial"/>
@@ -1599,7 +1599,7 @@
         <w:pStyle w:val="Normal"/>
         <w:spacing w:after="20" w:before="120" w:line="240" w:lineRule="auto"/>
       </w:pPr>
-      <w:hyperlink w:history="1" r:id="rIdtrigg2_xptitzjm3fasog">
+      <w:hyperlink w:history="1" r:id="rIdmqis_qxchps27vu9k2ehp">
         <w:r>
           <w:rPr>
             <w:rFonts w:ascii="Arial" w:cs="Arial" w:eastAsia="Arial" w:hAnsi="Arial"/>
@@ -1632,7 +1632,7 @@
         </w:rPr>
         <w:t xml:space="preserve">  |  </w:t>
       </w:r>
-      <w:hyperlink w:history="1" r:id="rIdkvgkffqv2kpdszejz25sk">
+      <w:hyperlink w:history="1" r:id="rIdh44kn7wvona_yq_tzfdff">
         <w:r>
           <w:rPr>
             <w:rFonts w:ascii="Arial" w:cs="Arial" w:eastAsia="Arial" w:hAnsi="Arial"/>

</xml_diff>

<commit_message>
Use 'Google Play Store' for the store name
Co-Authored-By: Claude Opus 5 <noreply@anthropic.com>
</commit_message>
<xml_diff>
--- a/public/travis-hoki-resume.docx
+++ b/public/travis-hoki-resume.docx
@@ -58,7 +58,7 @@
         </w:rPr>
         <w:t xml:space="preserve">  |  </w:t>
       </w:r>
-      <w:hyperlink w:history="1" r:id="rIdbn4kqxvjdh0dpwj0klovp">
+      <w:hyperlink w:history="1" r:id="rIdrwrw-aom7py_yqs2bznne">
         <w:r>
           <w:rPr>
             <w:rFonts w:ascii="Arial" w:cs="Arial" w:eastAsia="Arial" w:hAnsi="Arial"/>
@@ -77,7 +77,7 @@
         </w:rPr>
         <w:t xml:space="preserve">  |  </w:t>
       </w:r>
-      <w:hyperlink w:history="1" r:id="rIdpfvvdbpew9kman8bbefxy">
+      <w:hyperlink w:history="1" r:id="rId7dvmq_g5iyr_hizxmj-ec">
         <w:r>
           <w:rPr>
             <w:rFonts w:ascii="Arial" w:cs="Arial" w:eastAsia="Arial" w:hAnsi="Arial"/>
@@ -95,7 +95,7 @@
         <w:spacing w:after="160" w:line="240" w:lineRule="auto"/>
         <w:jc w:val="center"/>
       </w:pPr>
-      <w:hyperlink w:history="1" r:id="rIdvfmg_modfxdzbwumxrwbv">
+      <w:hyperlink w:history="1" r:id="rIdtkmgdetblztxldw9dmris">
         <w:r>
           <w:rPr>
             <w:rFonts w:ascii="Arial" w:cs="Arial" w:eastAsia="Arial" w:hAnsi="Arial"/>
@@ -114,7 +114,7 @@
         </w:rPr>
         <w:t xml:space="preserve">  |  </w:t>
       </w:r>
-      <w:hyperlink w:history="1" r:id="rIdarcjoabz7vuzopfa2gdlr">
+      <w:hyperlink w:history="1" r:id="rIdtned1o92pywkofy6yvzvn">
         <w:r>
           <w:rPr>
             <w:rFonts w:ascii="Arial" w:cs="Arial" w:eastAsia="Arial" w:hAnsi="Arial"/>
@@ -133,7 +133,7 @@
         </w:rPr>
         <w:t xml:space="preserve">  |  </w:t>
       </w:r>
-      <w:hyperlink w:history="1" r:id="rIdrp6mc-fcwuo3h2_t7l_ae">
+      <w:hyperlink w:history="1" r:id="rIdsptnrhxkhunom49s5rebz">
         <w:r>
           <w:rPr>
             <w:rFonts w:ascii="Arial" w:cs="Arial" w:eastAsia="Arial" w:hAnsi="Arial"/>
@@ -1275,7 +1275,7 @@
         <w:pStyle w:val="Normal"/>
         <w:spacing w:after="20" w:before="120" w:line="240" w:lineRule="auto"/>
       </w:pPr>
-      <w:hyperlink w:history="1" r:id="rIdsdhhgolfoowkba8bwlvwa">
+      <w:hyperlink w:history="1" r:id="rIdprkxzp2dg0ehv7sg4obvb">
         <w:r>
           <w:rPr>
             <w:rFonts w:ascii="Arial" w:cs="Arial" w:eastAsia="Arial" w:hAnsi="Arial"/>
@@ -1308,7 +1308,7 @@
         </w:rPr>
         <w:t xml:space="preserve">  |  </w:t>
       </w:r>
-      <w:hyperlink w:history="1" r:id="rIdutmcarlllu-ofkwffthzg">
+      <w:hyperlink w:history="1" r:id="rIdpa14kibvs0w3ourrdzmht">
         <w:r>
           <w:rPr>
             <w:rFonts w:ascii="Arial" w:cs="Arial" w:eastAsia="Arial" w:hAnsi="Arial"/>
@@ -1339,7 +1339,7 @@
         <w:pStyle w:val="Normal"/>
         <w:spacing w:after="20" w:before="120" w:line="240" w:lineRule="auto"/>
       </w:pPr>
-      <w:hyperlink w:history="1" r:id="rIdq6jwyxa-98otqbtgpvbit">
+      <w:hyperlink w:history="1" r:id="rIdo1-7dxkcvb97yhmax3fvx">
         <w:r>
           <w:rPr>
             <w:rFonts w:ascii="Arial" w:cs="Arial" w:eastAsia="Arial" w:hAnsi="Arial"/>
@@ -1372,7 +1372,7 @@
         </w:rPr>
         <w:t xml:space="preserve">  |  </w:t>
       </w:r>
-      <w:hyperlink w:history="1" r:id="rIdt4xhvsup5qpdqb8dda4ps">
+      <w:hyperlink w:history="1" r:id="rIdcktmseovk8icotglii6zy">
         <w:r>
           <w:rPr>
             <w:rFonts w:ascii="Arial" w:cs="Arial" w:eastAsia="Arial" w:hAnsi="Arial"/>
@@ -1403,7 +1403,7 @@
         <w:pStyle w:val="Normal"/>
         <w:spacing w:after="20" w:before="120" w:line="240" w:lineRule="auto"/>
       </w:pPr>
-      <w:hyperlink w:history="1" r:id="rIdtus0jtbigi4jrvh1w-mo-">
+      <w:hyperlink w:history="1" r:id="rId-jjlebwogx8mjdaqq5nfb">
         <w:r>
           <w:rPr>
             <w:rFonts w:ascii="Arial" w:cs="Arial" w:eastAsia="Arial" w:hAnsi="Arial"/>
@@ -1436,7 +1436,7 @@
         </w:rPr>
         <w:t xml:space="preserve">  |  </w:t>
       </w:r>
-      <w:hyperlink w:history="1" r:id="rIdmbrykoshlw1fplgg8niua">
+      <w:hyperlink w:history="1" r:id="rIdi5euw1fhgz-w02a3zrkgm">
         <w:r>
           <w:rPr>
             <w:rFonts w:ascii="Arial" w:cs="Arial" w:eastAsia="Arial" w:hAnsi="Arial"/>
@@ -1461,7 +1461,7 @@
         </w:rPr>
         <w:t xml:space="preserve">Designed, illustrated, and built a mobile game in React Native, shipping one codebase to iOS and Android as real native UI. Published on the </w:t>
       </w:r>
-      <w:hyperlink w:history="1" r:id="rIdtwwe5wto-auhukmdnt8ng">
+      <w:hyperlink w:history="1" r:id="rIdofgsoji2cd1o_gizklobi">
         <w:r>
           <w:rPr>
             <w:rFonts w:ascii="Arial" w:cs="Arial" w:eastAsia="Arial" w:hAnsi="Arial"/>
@@ -1480,7 +1480,7 @@
         </w:rPr>
         <w:t xml:space="preserve"> and </w:t>
       </w:r>
-      <w:hyperlink w:history="1" r:id="rIdc1hn3ikysn3z3ryd64ill">
+      <w:hyperlink w:history="1" r:id="rIdts3l60tug0y11xlrsp1f3">
         <w:r>
           <w:rPr>
             <w:rFonts w:ascii="Arial" w:cs="Arial" w:eastAsia="Arial" w:hAnsi="Arial"/>
@@ -1488,7 +1488,7 @@
             <w:sz w:val="19"/>
             <w:szCs w:val="19"/>
           </w:rPr>
-          <w:t xml:space="preserve">Google Play</w:t>
+          <w:t xml:space="preserve">Google Play Store</w:t>
         </w:r>
       </w:hyperlink>
       <w:r>
@@ -1618,7 +1618,7 @@
         <w:pStyle w:val="Normal"/>
         <w:spacing w:after="20" w:before="120" w:line="240" w:lineRule="auto"/>
       </w:pPr>
-      <w:hyperlink w:history="1" r:id="rIdif4cuxaomjk3wkexxwst_">
+      <w:hyperlink w:history="1" r:id="rIdv86paidsiymn3s06_y_y-">
         <w:r>
           <w:rPr>
             <w:rFonts w:ascii="Arial" w:cs="Arial" w:eastAsia="Arial" w:hAnsi="Arial"/>
@@ -1651,7 +1651,7 @@
         </w:rPr>
         <w:t xml:space="preserve">  |  </w:t>
       </w:r>
-      <w:hyperlink w:history="1" r:id="rIdu4cezf2tjunnsgrbogosw">
+      <w:hyperlink w:history="1" r:id="rIdv4ttllpagfgdhtbr-20wx">
         <w:r>
           <w:rPr>
             <w:rFonts w:ascii="Arial" w:cs="Arial" w:eastAsia="Arial" w:hAnsi="Arial"/>

</xml_diff>